<commit_message>
feat: add test email utility, environment configuration, and ignore patterns for credentials and build files
</commit_message>
<xml_diff>
--- a/script-laporan-bulanan/input/202606/weekly_report.docx
+++ b/script-laporan-bulanan/input/202606/weekly_report.docx
@@ -305,7 +305,7 @@
                 <w:rFonts w:ascii="Calibri" w:hAnsi="Calibri"/>
                 <w:sz w:val="18"/>
               </w:rPr>
-              <w:t>1-6</w:t>
+              <w:t>1-5</w:t>
             </w:r>
           </w:p>
         </w:tc>
@@ -747,7 +747,7 @@
                 <w:rFonts w:ascii="Calibri" w:hAnsi="Calibri"/>
                 <w:sz w:val="18"/>
               </w:rPr>
-              <w:t>7-15</w:t>
+              <w:t>8-12</w:t>
             </w:r>
           </w:p>
         </w:tc>
@@ -1299,19 +1299,19 @@
                 <w:rFonts w:ascii="Calibri" w:hAnsi="Calibri"/>
                 <w:sz w:val="18"/>
               </w:rPr>
-              <w:t>Memperbaiki sorting objek pengawasan dan alias Vuetify</w:t>
-            </w:r>
-          </w:p>
-        </w:tc>
-        <w:tc>
-          <w:tcPr/>
-          <w:p>
-            <w:r>
-              <w:rPr>
-                <w:rFonts w:ascii="Calibri" w:hAnsi="Calibri"/>
-                <w:sz w:val="18"/>
-              </w:rPr>
-              <w:t>Implementasi perbaikan sorting kolom provinsi/kabupaten pada objek pengawasan dan alias sorting .name dari UI Vuetify</w:t>
+              <w:t>Implementasi unified dashboard export</w:t>
+            </w:r>
+          </w:p>
+        </w:tc>
+        <w:tc>
+          <w:tcPr/>
+          <w:p>
+            <w:r>
+              <w:rPr>
+                <w:rFonts w:ascii="Calibri" w:hAnsi="Calibri"/>
+                <w:sz w:val="18"/>
+              </w:rPr>
+              <w:t>Implementasi fitur export terpadu untuk semua kategori dashboard pimpinan</w:t>
             </w:r>
           </w:p>
         </w:tc>
@@ -1335,7 +1335,7 @@
                 <w:rFonts w:ascii="Calibri" w:hAnsi="Calibri"/>
                 <w:sz w:val="18"/>
               </w:rPr>
-              <w:t>https://github.com/setditjen-psdkp/api-sip/pull/5300 https://github.com/setditjen-psdkp/api-sip/pull/5302</w:t>
+              <w:t>https://github.com/setditjen-psdkp/api-sip/pull/5299</w:t>
             </w:r>
           </w:p>
         </w:tc>
@@ -1387,19 +1387,19 @@
                 <w:rFonts w:ascii="Calibri" w:hAnsi="Calibri"/>
                 <w:sz w:val="18"/>
               </w:rPr>
-              <w:t>Memperbaiki timeout dan deteksi file sinkronisasi OSS</w:t>
-            </w:r>
-          </w:p>
-        </w:tc>
-        <w:tc>
-          <w:tcPr/>
-          <w:p>
-            <w:r>
-              <w:rPr>
-                <w:rFonts w:ascii="Calibri" w:hAnsi="Calibri"/>
-                <w:sz w:val="18"/>
-              </w:rPr>
-              <w:t>Implementasi perbaikan fail-fast timeout, deteksi file, PDF stripping, dan penanganan long whitespace pada sinkronisasi OSS/KKPRL</w:t>
+              <w:t>Memperbaiki sorting objek pengawasan dan alias Vuetify</w:t>
+            </w:r>
+          </w:p>
+        </w:tc>
+        <w:tc>
+          <w:tcPr/>
+          <w:p>
+            <w:r>
+              <w:rPr>
+                <w:rFonts w:ascii="Calibri" w:hAnsi="Calibri"/>
+                <w:sz w:val="18"/>
+              </w:rPr>
+              <w:t>Implementasi perbaikan sorting kolom provinsi/kabupaten pada objek pengawasan dan alias sorting .name dari UI Vuetify</w:t>
             </w:r>
           </w:p>
         </w:tc>
@@ -1423,7 +1423,7 @@
                 <w:rFonts w:ascii="Calibri" w:hAnsi="Calibri"/>
                 <w:sz w:val="18"/>
               </w:rPr>
-              <w:t>https://github.com/setditjen-psdkp/api-sip/pull/5301 https://github.com/setditjen-psdkp/api-sip/pull/5303 https://github.com/setditjen-psdkp/api-sip/pull/5304 https://github.com/setditjen-psdkp/api-sip/issues/5180</w:t>
+              <w:t>https://github.com/setditjen-psdkp/api-sip/pull/5300 https://github.com/setditjen-psdkp/api-sip/pull/5302</w:t>
             </w:r>
           </w:p>
         </w:tc>
@@ -1475,19 +1475,19 @@
                 <w:rFonts w:ascii="Calibri" w:hAnsi="Calibri"/>
                 <w:sz w:val="18"/>
               </w:rPr>
-              <w:t>Penyelesaian issue filter KKPRL berdasarkan unit kerja</w:t>
-            </w:r>
-          </w:p>
-        </w:tc>
-        <w:tc>
-          <w:tcPr/>
-          <w:p>
-            <w:r>
-              <w:rPr>
-                <w:rFonts w:ascii="Calibri" w:hAnsi="Calibri"/>
-                <w:sz w:val="18"/>
-              </w:rPr>
-              <w:t>Penyelesaian issue filter list KKPRL dalam detail berdasarkan unit kerja</w:t>
+              <w:t>Memperbaiki timeout dan deteksi file sinkronisasi OSS</w:t>
+            </w:r>
+          </w:p>
+        </w:tc>
+        <w:tc>
+          <w:tcPr/>
+          <w:p>
+            <w:r>
+              <w:rPr>
+                <w:rFonts w:ascii="Calibri" w:hAnsi="Calibri"/>
+                <w:sz w:val="18"/>
+              </w:rPr>
+              <w:t>Implementasi perbaikan fail-fast timeout, deteksi file, PDF stripping, dan penanganan long whitespace pada sinkronisasi OSS/KKPRL</w:t>
             </w:r>
           </w:p>
         </w:tc>
@@ -1511,7 +1511,7 @@
                 <w:rFonts w:ascii="Calibri" w:hAnsi="Calibri"/>
                 <w:sz w:val="18"/>
               </w:rPr>
-              <w:t>https://github.com/setditjen-psdkp/api-sip/issues/4690</w:t>
+              <w:t>https://github.com/setditjen-psdkp/api-sip/pull/5301 https://github.com/setditjen-psdkp/api-sip/pull/5303 https://github.com/setditjen-psdkp/api-sip/pull/5304 https://github.com/setditjen-psdkp/api-sip/issues/5180</w:t>
             </w:r>
           </w:p>
         </w:tc>
@@ -1551,31 +1551,31 @@
                 <w:rFonts w:ascii="Calibri" w:hAnsi="Calibri"/>
                 <w:sz w:val="18"/>
               </w:rPr>
-              <w:t>14</w:t>
-            </w:r>
-          </w:p>
-        </w:tc>
-        <w:tc>
-          <w:tcPr/>
-          <w:p>
-            <w:r>
-              <w:rPr>
-                <w:rFonts w:ascii="Calibri" w:hAnsi="Calibri"/>
-                <w:sz w:val="18"/>
-              </w:rPr>
-              <w:t>Release update production from stage</w:t>
-            </w:r>
-          </w:p>
-        </w:tc>
-        <w:tc>
-          <w:tcPr/>
-          <w:p>
-            <w:r>
-              <w:rPr>
-                <w:rFonts w:ascii="Calibri" w:hAnsi="Calibri"/>
-                <w:sz w:val="18"/>
-              </w:rPr>
-              <w:t>Implementasi rilis pembaruan branch production dari stage</w:t>
+              <w:t>12</w:t>
+            </w:r>
+          </w:p>
+        </w:tc>
+        <w:tc>
+          <w:tcPr/>
+          <w:p>
+            <w:r>
+              <w:rPr>
+                <w:rFonts w:ascii="Calibri" w:hAnsi="Calibri"/>
+                <w:sz w:val="18"/>
+              </w:rPr>
+              <w:t>Penyelesaian issue filter KKPRL berdasarkan unit kerja</w:t>
+            </w:r>
+          </w:p>
+        </w:tc>
+        <w:tc>
+          <w:tcPr/>
+          <w:p>
+            <w:r>
+              <w:rPr>
+                <w:rFonts w:ascii="Calibri" w:hAnsi="Calibri"/>
+                <w:sz w:val="18"/>
+              </w:rPr>
+              <w:t>Penyelesaian issue filter list KKPRL dalam detail berdasarkan unit kerja</w:t>
             </w:r>
           </w:p>
         </w:tc>
@@ -1599,7 +1599,7 @@
                 <w:rFonts w:ascii="Calibri" w:hAnsi="Calibri"/>
                 <w:sz w:val="18"/>
               </w:rPr>
-              <w:t>https://github.com/setditjen-psdkp/api-sip/pull/5306</w:t>
+              <w:t>https://github.com/setditjen-psdkp/api-sip/issues/4690</w:t>
             </w:r>
           </w:p>
         </w:tc>
@@ -1617,17 +1617,19 @@
                 <w:rFonts w:ascii="Calibri" w:hAnsi="Calibri"/>
                 <w:sz w:val="18"/>
               </w:rPr>
-            </w:r>
-          </w:p>
-        </w:tc>
-        <w:tc>
-          <w:tcPr/>
-          <w:p>
-            <w:r>
-              <w:rPr>
-                <w:rFonts w:ascii="Calibri" w:hAnsi="Calibri"/>
-                <w:sz w:val="18"/>
-              </w:rPr>
+              <w:t>W3</w:t>
+            </w:r>
+          </w:p>
+        </w:tc>
+        <w:tc>
+          <w:tcPr/>
+          <w:p>
+            <w:r>
+              <w:rPr>
+                <w:rFonts w:ascii="Calibri" w:hAnsi="Calibri"/>
+                <w:sz w:val="18"/>
+              </w:rPr>
+              <w:t>15-19</w:t>
             </w:r>
           </w:p>
         </w:tc>
@@ -1651,19 +1653,19 @@
                 <w:rFonts w:ascii="Calibri" w:hAnsi="Calibri"/>
                 <w:sz w:val="18"/>
               </w:rPr>
-              <w:t>Hotfix server error 500 simpan kepatuhan teknis</w:t>
-            </w:r>
-          </w:p>
-        </w:tc>
-        <w:tc>
-          <w:tcPr/>
-          <w:p>
-            <w:r>
-              <w:rPr>
-                <w:rFonts w:ascii="Calibri" w:hAnsi="Calibri"/>
-                <w:sz w:val="18"/>
-              </w:rPr>
-              <w:t>Implementasi hotfix resolusi error 500 dan import class Auth pada modul kepatuhan teknis</w:t>
+              <w:t>Release update production from stage</w:t>
+            </w:r>
+          </w:p>
+        </w:tc>
+        <w:tc>
+          <w:tcPr/>
+          <w:p>
+            <w:r>
+              <w:rPr>
+                <w:rFonts w:ascii="Calibri" w:hAnsi="Calibri"/>
+                <w:sz w:val="18"/>
+              </w:rPr>
+              <w:t>Implementasi rilis pembaruan branch production dari stage</w:t>
             </w:r>
           </w:p>
         </w:tc>
@@ -1687,7 +1689,7 @@
                 <w:rFonts w:ascii="Calibri" w:hAnsi="Calibri"/>
                 <w:sz w:val="18"/>
               </w:rPr>
-              <w:t>https://github.com/setditjen-psdkp/api-sip/pull/5308 https://github.com/setditjen-psdkp/api-sip/pull/5310</w:t>
+              <w:t>https://github.com/setditjen-psdkp/api-sip/pull/5306</w:t>
             </w:r>
           </w:p>
         </w:tc>
@@ -1739,19 +1741,19 @@
                 <w:rFonts w:ascii="Calibri" w:hAnsi="Calibri"/>
                 <w:sz w:val="18"/>
               </w:rPr>
-              <w:t>Menyusun dokumentasi laporan perbaikan bug kepatuhan teknis</w:t>
-            </w:r>
-          </w:p>
-        </w:tc>
-        <w:tc>
-          <w:tcPr/>
-          <w:p>
-            <w:r>
-              <w:rPr>
-                <w:rFonts w:ascii="Calibri" w:hAnsi="Calibri"/>
-                <w:sz w:val="18"/>
-              </w:rPr>
-              <w:t>Penyusunan dokumentasi laporan perbaikan bug kepatuhan teknis</w:t>
+              <w:t>Hotfix server error 500 simpan kepatuhan teknis</w:t>
+            </w:r>
+          </w:p>
+        </w:tc>
+        <w:tc>
+          <w:tcPr/>
+          <w:p>
+            <w:r>
+              <w:rPr>
+                <w:rFonts w:ascii="Calibri" w:hAnsi="Calibri"/>
+                <w:sz w:val="18"/>
+              </w:rPr>
+              <w:t>Implementasi hotfix resolusi error 500 dan import class Auth pada modul kepatuhan teknis</w:t>
             </w:r>
           </w:p>
         </w:tc>
@@ -1775,7 +1777,7 @@
                 <w:rFonts w:ascii="Calibri" w:hAnsi="Calibri"/>
                 <w:sz w:val="18"/>
               </w:rPr>
-              <w:t>https://github.com/setditjen-psdkp/api-sip/pull/5311</w:t>
+              <w:t>https://github.com/setditjen-psdkp/api-sip/pull/5308 https://github.com/setditjen-psdkp/api-sip/pull/5310</w:t>
             </w:r>
           </w:p>
         </w:tc>
@@ -1815,50 +1817,55 @@
                 <w:rFonts w:ascii="Calibri" w:hAnsi="Calibri"/>
                 <w:sz w:val="18"/>
               </w:rPr>
-            </w:r>
-          </w:p>
-        </w:tc>
-        <w:tc>
-          <w:tcPr/>
-          <w:p>
-            <w:r>
-              <w:rPr>
-                <w:rFonts w:ascii="Calibri" w:hAnsi="Calibri"/>
-                <w:sz w:val="18"/>
-              </w:rPr>
-            </w:r>
-          </w:p>
-        </w:tc>
-        <w:tc>
-          <w:tcPr/>
-          <w:p>
-            <w:r>
-              <w:rPr>
-                <w:rFonts w:ascii="Calibri" w:hAnsi="Calibri"/>
-                <w:sz w:val="18"/>
-              </w:rPr>
-            </w:r>
-          </w:p>
-        </w:tc>
-        <w:tc>
-          <w:tcPr/>
-          <w:p>
-            <w:r>
-              <w:rPr>
-                <w:rFonts w:ascii="Calibri" w:hAnsi="Calibri"/>
-                <w:sz w:val="18"/>
-              </w:rPr>
-            </w:r>
-          </w:p>
-        </w:tc>
-        <w:tc>
-          <w:tcPr/>
-          <w:p>
-            <w:r>
-              <w:rPr>
-                <w:rFonts w:ascii="Calibri" w:hAnsi="Calibri"/>
-                <w:sz w:val="18"/>
-              </w:rPr>
+              <w:t>15</w:t>
+            </w:r>
+          </w:p>
+        </w:tc>
+        <w:tc>
+          <w:tcPr/>
+          <w:p>
+            <w:r>
+              <w:rPr>
+                <w:rFonts w:ascii="Calibri" w:hAnsi="Calibri"/>
+                <w:sz w:val="18"/>
+              </w:rPr>
+              <w:t>Menyusun dokumentasi laporan perbaikan bug kepatuhan teknis</w:t>
+            </w:r>
+          </w:p>
+        </w:tc>
+        <w:tc>
+          <w:tcPr/>
+          <w:p>
+            <w:r>
+              <w:rPr>
+                <w:rFonts w:ascii="Calibri" w:hAnsi="Calibri"/>
+                <w:sz w:val="18"/>
+              </w:rPr>
+              <w:t>Penyusunan dokumentasi laporan perbaikan bug kepatuhan teknis</w:t>
+            </w:r>
+          </w:p>
+        </w:tc>
+        <w:tc>
+          <w:tcPr/>
+          <w:p>
+            <w:r>
+              <w:rPr>
+                <w:rFonts w:ascii="Calibri" w:hAnsi="Calibri"/>
+                <w:sz w:val="18"/>
+              </w:rPr>
+              <w:t>Lutfi</w:t>
+            </w:r>
+          </w:p>
+        </w:tc>
+        <w:tc>
+          <w:tcPr/>
+          <w:p>
+            <w:r>
+              <w:rPr>
+                <w:rFonts w:ascii="Calibri" w:hAnsi="Calibri"/>
+                <w:sz w:val="18"/>
+              </w:rPr>
+              <w:t>https://github.com/setditjen-psdkp/api-sip/pull/5311</w:t>
             </w:r>
           </w:p>
         </w:tc>
@@ -1898,50 +1905,55 @@
                 <w:rFonts w:ascii="Calibri" w:hAnsi="Calibri"/>
                 <w:sz w:val="18"/>
               </w:rPr>
-            </w:r>
-          </w:p>
-        </w:tc>
-        <w:tc>
-          <w:tcPr/>
-          <w:p>
-            <w:r>
-              <w:rPr>
-                <w:rFonts w:ascii="Calibri" w:hAnsi="Calibri"/>
-                <w:sz w:val="18"/>
-              </w:rPr>
-            </w:r>
-          </w:p>
-        </w:tc>
-        <w:tc>
-          <w:tcPr/>
-          <w:p>
-            <w:r>
-              <w:rPr>
-                <w:rFonts w:ascii="Calibri" w:hAnsi="Calibri"/>
-                <w:sz w:val="18"/>
-              </w:rPr>
-            </w:r>
-          </w:p>
-        </w:tc>
-        <w:tc>
-          <w:tcPr/>
-          <w:p>
-            <w:r>
-              <w:rPr>
-                <w:rFonts w:ascii="Calibri" w:hAnsi="Calibri"/>
-                <w:sz w:val="18"/>
-              </w:rPr>
-            </w:r>
-          </w:p>
-        </w:tc>
-        <w:tc>
-          <w:tcPr/>
-          <w:p>
-            <w:r>
-              <w:rPr>
-                <w:rFonts w:ascii="Calibri" w:hAnsi="Calibri"/>
-                <w:sz w:val="18"/>
-              </w:rPr>
+              <w:t>15</w:t>
+            </w:r>
+          </w:p>
+        </w:tc>
+        <w:tc>
+          <w:tcPr/>
+          <w:p>
+            <w:r>
+              <w:rPr>
+                <w:rFonts w:ascii="Calibri" w:hAnsi="Calibri"/>
+                <w:sz w:val="18"/>
+              </w:rPr>
+              <w:t>Memperbaiki akses data lintas unit untuk pengawas perikanan</w:t>
+            </w:r>
+          </w:p>
+        </w:tc>
+        <w:tc>
+          <w:tcPr/>
+          <w:p>
+            <w:r>
+              <w:rPr>
+                <w:rFonts w:ascii="Calibri" w:hAnsi="Calibri"/>
+                <w:sz w:val="18"/>
+              </w:rPr>
+              <w:t>Telah diimplementasikan memperbaiki akses data lintas unit untuk pengawas perikanan</w:t>
+            </w:r>
+          </w:p>
+        </w:tc>
+        <w:tc>
+          <w:tcPr/>
+          <w:p>
+            <w:r>
+              <w:rPr>
+                <w:rFonts w:ascii="Calibri" w:hAnsi="Calibri"/>
+                <w:sz w:val="18"/>
+              </w:rPr>
+              <w:t>Lutfi</w:t>
+            </w:r>
+          </w:p>
+        </w:tc>
+        <w:tc>
+          <w:tcPr/>
+          <w:p>
+            <w:r>
+              <w:rPr>
+                <w:rFonts w:ascii="Calibri" w:hAnsi="Calibri"/>
+                <w:sz w:val="18"/>
+              </w:rPr>
+              <w:t>https://github.com/setditjen-psdkp/api-sip/pull/5312</w:t>
             </w:r>
           </w:p>
         </w:tc>
@@ -1981,50 +1993,55 @@
                 <w:rFonts w:ascii="Calibri" w:hAnsi="Calibri"/>
                 <w:sz w:val="18"/>
               </w:rPr>
-            </w:r>
-          </w:p>
-        </w:tc>
-        <w:tc>
-          <w:tcPr/>
-          <w:p>
-            <w:r>
-              <w:rPr>
-                <w:rFonts w:ascii="Calibri" w:hAnsi="Calibri"/>
-                <w:sz w:val="18"/>
-              </w:rPr>
-            </w:r>
-          </w:p>
-        </w:tc>
-        <w:tc>
-          <w:tcPr/>
-          <w:p>
-            <w:r>
-              <w:rPr>
-                <w:rFonts w:ascii="Calibri" w:hAnsi="Calibri"/>
-                <w:sz w:val="18"/>
-              </w:rPr>
-            </w:r>
-          </w:p>
-        </w:tc>
-        <w:tc>
-          <w:tcPr/>
-          <w:p>
-            <w:r>
-              <w:rPr>
-                <w:rFonts w:ascii="Calibri" w:hAnsi="Calibri"/>
-                <w:sz w:val="18"/>
-              </w:rPr>
-            </w:r>
-          </w:p>
-        </w:tc>
-        <w:tc>
-          <w:tcPr/>
-          <w:p>
-            <w:r>
-              <w:rPr>
-                <w:rFonts w:ascii="Calibri" w:hAnsi="Calibri"/>
-                <w:sz w:val="18"/>
-              </w:rPr>
+              <w:t>16</w:t>
+            </w:r>
+          </w:p>
+        </w:tc>
+        <w:tc>
+          <w:tcPr/>
+          <w:p>
+            <w:r>
+              <w:rPr>
+                <w:rFonts w:ascii="Calibri" w:hAnsi="Calibri"/>
+                <w:sz w:val="18"/>
+              </w:rPr>
+              <w:t>Meningkatkan keamanan sistem, memperbaiki peta situs, dan menyesuaikan halaman admin</w:t>
+            </w:r>
+          </w:p>
+        </w:tc>
+        <w:tc>
+          <w:tcPr/>
+          <w:p>
+            <w:r>
+              <w:rPr>
+                <w:rFonts w:ascii="Calibri" w:hAnsi="Calibri"/>
+                <w:sz w:val="18"/>
+              </w:rPr>
+              <w:t>Telah diimplementasikan meningkatkan keamanan sistem, memperbaiki peta situs, dan menyesuaikan halaman admin</w:t>
+            </w:r>
+          </w:p>
+        </w:tc>
+        <w:tc>
+          <w:tcPr/>
+          <w:p>
+            <w:r>
+              <w:rPr>
+                <w:rFonts w:ascii="Calibri" w:hAnsi="Calibri"/>
+                <w:sz w:val="18"/>
+              </w:rPr>
+              <w:t>Lutfi</w:t>
+            </w:r>
+          </w:p>
+        </w:tc>
+        <w:tc>
+          <w:tcPr/>
+          <w:p>
+            <w:r>
+              <w:rPr>
+                <w:rFonts w:ascii="Calibri" w:hAnsi="Calibri"/>
+                <w:sz w:val="18"/>
+              </w:rPr>
+              <w:t>https://github.com/BrillianLabs/grafisaid_backend/pull/15</w:t>
             </w:r>
           </w:p>
         </w:tc>
@@ -2064,50 +2081,55 @@
                 <w:rFonts w:ascii="Calibri" w:hAnsi="Calibri"/>
                 <w:sz w:val="18"/>
               </w:rPr>
-            </w:r>
-          </w:p>
-        </w:tc>
-        <w:tc>
-          <w:tcPr/>
-          <w:p>
-            <w:r>
-              <w:rPr>
-                <w:rFonts w:ascii="Calibri" w:hAnsi="Calibri"/>
-                <w:sz w:val="18"/>
-              </w:rPr>
-            </w:r>
-          </w:p>
-        </w:tc>
-        <w:tc>
-          <w:tcPr/>
-          <w:p>
-            <w:r>
-              <w:rPr>
-                <w:rFonts w:ascii="Calibri" w:hAnsi="Calibri"/>
-                <w:sz w:val="18"/>
-              </w:rPr>
-            </w:r>
-          </w:p>
-        </w:tc>
-        <w:tc>
-          <w:tcPr/>
-          <w:p>
-            <w:r>
-              <w:rPr>
-                <w:rFonts w:ascii="Calibri" w:hAnsi="Calibri"/>
-                <w:sz w:val="18"/>
-              </w:rPr>
-            </w:r>
-          </w:p>
-        </w:tc>
-        <w:tc>
-          <w:tcPr/>
-          <w:p>
-            <w:r>
-              <w:rPr>
-                <w:rFonts w:ascii="Calibri" w:hAnsi="Calibri"/>
-                <w:sz w:val="18"/>
-              </w:rPr>
+              <w:t>17</w:t>
+            </w:r>
+          </w:p>
+        </w:tc>
+        <w:tc>
+          <w:tcPr/>
+          <w:p>
+            <w:r>
+              <w:rPr>
+                <w:rFonts w:ascii="Calibri" w:hAnsi="Calibri"/>
+                <w:sz w:val="18"/>
+              </w:rPr>
+              <w:t>Memperbarui dokumentasi pemeriksaan keamanan server</w:t>
+            </w:r>
+          </w:p>
+        </w:tc>
+        <w:tc>
+          <w:tcPr/>
+          <w:p>
+            <w:r>
+              <w:rPr>
+                <w:rFonts w:ascii="Calibri" w:hAnsi="Calibri"/>
+                <w:sz w:val="18"/>
+              </w:rPr>
+              <w:t>Telah diimplementasikan memperbarui dokumentasi pemeriksaan keamanan server</w:t>
+            </w:r>
+          </w:p>
+        </w:tc>
+        <w:tc>
+          <w:tcPr/>
+          <w:p>
+            <w:r>
+              <w:rPr>
+                <w:rFonts w:ascii="Calibri" w:hAnsi="Calibri"/>
+                <w:sz w:val="18"/>
+              </w:rPr>
+              <w:t>Lutfi</w:t>
+            </w:r>
+          </w:p>
+        </w:tc>
+        <w:tc>
+          <w:tcPr/>
+          <w:p>
+            <w:r>
+              <w:rPr>
+                <w:rFonts w:ascii="Calibri" w:hAnsi="Calibri"/>
+                <w:sz w:val="18"/>
+              </w:rPr>
+              <w:t>https://github.com/Ummi-Foundation/simuf/pull/2258</w:t>
             </w:r>
           </w:p>
         </w:tc>
@@ -2147,50 +2169,55 @@
                 <w:rFonts w:ascii="Calibri" w:hAnsi="Calibri"/>
                 <w:sz w:val="18"/>
               </w:rPr>
-            </w:r>
-          </w:p>
-        </w:tc>
-        <w:tc>
-          <w:tcPr/>
-          <w:p>
-            <w:r>
-              <w:rPr>
-                <w:rFonts w:ascii="Calibri" w:hAnsi="Calibri"/>
-                <w:sz w:val="18"/>
-              </w:rPr>
-            </w:r>
-          </w:p>
-        </w:tc>
-        <w:tc>
-          <w:tcPr/>
-          <w:p>
-            <w:r>
-              <w:rPr>
-                <w:rFonts w:ascii="Calibri" w:hAnsi="Calibri"/>
-                <w:sz w:val="18"/>
-              </w:rPr>
-            </w:r>
-          </w:p>
-        </w:tc>
-        <w:tc>
-          <w:tcPr/>
-          <w:p>
-            <w:r>
-              <w:rPr>
-                <w:rFonts w:ascii="Calibri" w:hAnsi="Calibri"/>
-                <w:sz w:val="18"/>
-              </w:rPr>
-            </w:r>
-          </w:p>
-        </w:tc>
-        <w:tc>
-          <w:tcPr/>
-          <w:p>
-            <w:r>
-              <w:rPr>
-                <w:rFonts w:ascii="Calibri" w:hAnsi="Calibri"/>
-                <w:sz w:val="18"/>
-              </w:rPr>
+              <w:t>17</w:t>
+            </w:r>
+          </w:p>
+        </w:tc>
+        <w:tc>
+          <w:tcPr/>
+          <w:p>
+            <w:r>
+              <w:rPr>
+                <w:rFonts w:ascii="Calibri" w:hAnsi="Calibri"/>
+                <w:sz w:val="18"/>
+              </w:rPr>
+              <w:t>Menyiapkan alat bantu untuk pemeriksaan rutin server</w:t>
+            </w:r>
+          </w:p>
+        </w:tc>
+        <w:tc>
+          <w:tcPr/>
+          <w:p>
+            <w:r>
+              <w:rPr>
+                <w:rFonts w:ascii="Calibri" w:hAnsi="Calibri"/>
+                <w:sz w:val="18"/>
+              </w:rPr>
+              <w:t>Telah diimplementasikan menyiapkan alat bantu untuk pemeriksaan rutin server</w:t>
+            </w:r>
+          </w:p>
+        </w:tc>
+        <w:tc>
+          <w:tcPr/>
+          <w:p>
+            <w:r>
+              <w:rPr>
+                <w:rFonts w:ascii="Calibri" w:hAnsi="Calibri"/>
+                <w:sz w:val="18"/>
+              </w:rPr>
+              <w:t>Lutfi</w:t>
+            </w:r>
+          </w:p>
+        </w:tc>
+        <w:tc>
+          <w:tcPr/>
+          <w:p>
+            <w:r>
+              <w:rPr>
+                <w:rFonts w:ascii="Calibri" w:hAnsi="Calibri"/>
+                <w:sz w:val="18"/>
+              </w:rPr>
+              <w:t>https://github.com/Ummi-Foundation/simuf/pull/2261</w:t>
             </w:r>
           </w:p>
         </w:tc>
@@ -2231,50 +2258,55 @@
                 <w:rFonts w:ascii="Calibri" w:hAnsi="Calibri"/>
                 <w:sz w:val="18"/>
               </w:rPr>
-            </w:r>
-          </w:p>
-        </w:tc>
-        <w:tc>
-          <w:tcPr/>
-          <w:p>
-            <w:r>
-              <w:rPr>
-                <w:rFonts w:ascii="Calibri" w:hAnsi="Calibri"/>
-                <w:sz w:val="18"/>
-              </w:rPr>
-            </w:r>
-          </w:p>
-        </w:tc>
-        <w:tc>
-          <w:tcPr/>
-          <w:p>
-            <w:r>
-              <w:rPr>
-                <w:rFonts w:ascii="Calibri" w:hAnsi="Calibri"/>
-                <w:sz w:val="18"/>
-              </w:rPr>
-            </w:r>
-          </w:p>
-        </w:tc>
-        <w:tc>
-          <w:tcPr/>
-          <w:p>
-            <w:r>
-              <w:rPr>
-                <w:rFonts w:ascii="Calibri" w:hAnsi="Calibri"/>
-                <w:sz w:val="18"/>
-              </w:rPr>
-            </w:r>
-          </w:p>
-        </w:tc>
-        <w:tc>
-          <w:tcPr/>
-          <w:p>
-            <w:r>
-              <w:rPr>
-                <w:rFonts w:ascii="Calibri" w:hAnsi="Calibri"/>
-                <w:sz w:val="18"/>
-              </w:rPr>
+              <w:t>17</w:t>
+            </w:r>
+          </w:p>
+        </w:tc>
+        <w:tc>
+          <w:tcPr/>
+          <w:p>
+            <w:r>
+              <w:rPr>
+                <w:rFonts w:ascii="Calibri" w:hAnsi="Calibri"/>
+                <w:sz w:val="18"/>
+              </w:rPr>
+              <w:t>Membuat sistem menampilkan data periode terbaru secara otomatis</w:t>
+            </w:r>
+          </w:p>
+        </w:tc>
+        <w:tc>
+          <w:tcPr/>
+          <w:p>
+            <w:r>
+              <w:rPr>
+                <w:rFonts w:ascii="Calibri" w:hAnsi="Calibri"/>
+                <w:sz w:val="18"/>
+              </w:rPr>
+              <w:t>Telah diimplementasikan membuat sistem menampilkan data periode terbaru secara otomatis</w:t>
+            </w:r>
+          </w:p>
+        </w:tc>
+        <w:tc>
+          <w:tcPr/>
+          <w:p>
+            <w:r>
+              <w:rPr>
+                <w:rFonts w:ascii="Calibri" w:hAnsi="Calibri"/>
+                <w:sz w:val="18"/>
+              </w:rPr>
+              <w:t>Lutfi</w:t>
+            </w:r>
+          </w:p>
+        </w:tc>
+        <w:tc>
+          <w:tcPr/>
+          <w:p>
+            <w:r>
+              <w:rPr>
+                <w:rFonts w:ascii="Calibri" w:hAnsi="Calibri"/>
+                <w:sz w:val="18"/>
+              </w:rPr>
+              <w:t>https://github.com/setditjen-psdkp/api-sip/pull/5432</w:t>
             </w:r>
           </w:p>
         </w:tc>
@@ -2315,50 +2347,55 @@
                 <w:rFonts w:ascii="Calibri" w:hAnsi="Calibri"/>
                 <w:sz w:val="18"/>
               </w:rPr>
-            </w:r>
-          </w:p>
-        </w:tc>
-        <w:tc>
-          <w:tcPr/>
-          <w:p>
-            <w:r>
-              <w:rPr>
-                <w:rFonts w:ascii="Calibri" w:hAnsi="Calibri"/>
-                <w:sz w:val="18"/>
-              </w:rPr>
-            </w:r>
-          </w:p>
-        </w:tc>
-        <w:tc>
-          <w:tcPr/>
-          <w:p>
-            <w:r>
-              <w:rPr>
-                <w:rFonts w:ascii="Calibri" w:hAnsi="Calibri"/>
-                <w:sz w:val="18"/>
-              </w:rPr>
-            </w:r>
-          </w:p>
-        </w:tc>
-        <w:tc>
-          <w:tcPr/>
-          <w:p>
-            <w:r>
-              <w:rPr>
-                <w:rFonts w:ascii="Calibri" w:hAnsi="Calibri"/>
-                <w:sz w:val="18"/>
-              </w:rPr>
-            </w:r>
-          </w:p>
-        </w:tc>
-        <w:tc>
-          <w:tcPr/>
-          <w:p>
-            <w:r>
-              <w:rPr>
-                <w:rFonts w:ascii="Calibri" w:hAnsi="Calibri"/>
-                <w:sz w:val="18"/>
-              </w:rPr>
+              <w:t>17</w:t>
+            </w:r>
+          </w:p>
+        </w:tc>
+        <w:tc>
+          <w:tcPr/>
+          <w:p>
+            <w:r>
+              <w:rPr>
+                <w:rFonts w:ascii="Calibri" w:hAnsi="Calibri"/>
+                <w:sz w:val="18"/>
+              </w:rPr>
+              <w:t>Penyesuaian fitur unduh data (export) pada modul PSDKP Angka</w:t>
+            </w:r>
+          </w:p>
+        </w:tc>
+        <w:tc>
+          <w:tcPr/>
+          <w:p>
+            <w:r>
+              <w:rPr>
+                <w:rFonts w:ascii="Calibri" w:hAnsi="Calibri"/>
+                <w:sz w:val="18"/>
+              </w:rPr>
+              <w:t>Telah diimplementasikan penyesuaian fitur unduh data (export) pada modul psdkp angka</w:t>
+            </w:r>
+          </w:p>
+        </w:tc>
+        <w:tc>
+          <w:tcPr/>
+          <w:p>
+            <w:r>
+              <w:rPr>
+                <w:rFonts w:ascii="Calibri" w:hAnsi="Calibri"/>
+                <w:sz w:val="18"/>
+              </w:rPr>
+              <w:t>Lutfi</w:t>
+            </w:r>
+          </w:p>
+        </w:tc>
+        <w:tc>
+          <w:tcPr/>
+          <w:p>
+            <w:r>
+              <w:rPr>
+                <w:rFonts w:ascii="Calibri" w:hAnsi="Calibri"/>
+                <w:sz w:val="18"/>
+              </w:rPr>
+              <w:t>https://github.com/setditjen-psdkp/api-sip/pull/5433</w:t>
             </w:r>
           </w:p>
         </w:tc>
@@ -2377,73 +2414,77 @@
                 <w:rFonts w:ascii="Calibri" w:hAnsi="Calibri"/>
                 <w:sz w:val="18"/>
               </w:rPr>
-              <w:t>W3</w:t>
-            </w:r>
-          </w:p>
-        </w:tc>
-        <w:tc>
-          <w:tcPr/>
-          <w:p>
-            <w:r>
-              <w:rPr>
-                <w:rFonts w:ascii="Calibri" w:hAnsi="Calibri"/>
-                <w:sz w:val="18"/>
-              </w:rPr>
-            </w:r>
-          </w:p>
-        </w:tc>
-        <w:tc>
-          <w:tcPr/>
-          <w:p>
-            <w:r>
-              <w:rPr>
-                <w:rFonts w:ascii="Calibri" w:hAnsi="Calibri"/>
-                <w:sz w:val="18"/>
-              </w:rPr>
-            </w:r>
-          </w:p>
-        </w:tc>
-        <w:tc>
-          <w:tcPr/>
-          <w:p>
-            <w:r>
-              <w:rPr>
-                <w:rFonts w:ascii="Calibri" w:hAnsi="Calibri"/>
-                <w:sz w:val="18"/>
-              </w:rPr>
-            </w:r>
-          </w:p>
-        </w:tc>
-        <w:tc>
-          <w:tcPr/>
-          <w:p>
-            <w:r>
-              <w:rPr>
-                <w:rFonts w:ascii="Calibri" w:hAnsi="Calibri"/>
-                <w:sz w:val="18"/>
-              </w:rPr>
-            </w:r>
-          </w:p>
-        </w:tc>
-        <w:tc>
-          <w:tcPr/>
-          <w:p>
-            <w:r>
-              <w:rPr>
-                <w:rFonts w:ascii="Calibri" w:hAnsi="Calibri"/>
-                <w:sz w:val="18"/>
-              </w:rPr>
-            </w:r>
-          </w:p>
-        </w:tc>
-        <w:tc>
-          <w:tcPr/>
-          <w:p>
-            <w:r>
-              <w:rPr>
-                <w:rFonts w:ascii="Calibri" w:hAnsi="Calibri"/>
-                <w:sz w:val="18"/>
-              </w:rPr>
+            </w:r>
+          </w:p>
+        </w:tc>
+        <w:tc>
+          <w:tcPr/>
+          <w:p>
+            <w:r>
+              <w:rPr>
+                <w:rFonts w:ascii="Calibri" w:hAnsi="Calibri"/>
+                <w:sz w:val="18"/>
+              </w:rPr>
+            </w:r>
+          </w:p>
+        </w:tc>
+        <w:tc>
+          <w:tcPr/>
+          <w:p>
+            <w:r>
+              <w:rPr>
+                <w:rFonts w:ascii="Calibri" w:hAnsi="Calibri"/>
+                <w:sz w:val="18"/>
+              </w:rPr>
+              <w:t>17</w:t>
+            </w:r>
+          </w:p>
+        </w:tc>
+        <w:tc>
+          <w:tcPr/>
+          <w:p>
+            <w:r>
+              <w:rPr>
+                <w:rFonts w:ascii="Calibri" w:hAnsi="Calibri"/>
+                <w:sz w:val="18"/>
+              </w:rPr>
+              <w:t>Memperbaiki kendala teknis pada proses unduh data (export)</w:t>
+            </w:r>
+          </w:p>
+        </w:tc>
+        <w:tc>
+          <w:tcPr/>
+          <w:p>
+            <w:r>
+              <w:rPr>
+                <w:rFonts w:ascii="Calibri" w:hAnsi="Calibri"/>
+                <w:sz w:val="18"/>
+              </w:rPr>
+              <w:t>Telah diimplementasikan memperbaiki kendala teknis pada proses unduh data (export)</w:t>
+            </w:r>
+          </w:p>
+        </w:tc>
+        <w:tc>
+          <w:tcPr/>
+          <w:p>
+            <w:r>
+              <w:rPr>
+                <w:rFonts w:ascii="Calibri" w:hAnsi="Calibri"/>
+                <w:sz w:val="18"/>
+              </w:rPr>
+              <w:t>Lutfi</w:t>
+            </w:r>
+          </w:p>
+        </w:tc>
+        <w:tc>
+          <w:tcPr/>
+          <w:p>
+            <w:r>
+              <w:rPr>
+                <w:rFonts w:ascii="Calibri" w:hAnsi="Calibri"/>
+                <w:sz w:val="18"/>
+              </w:rPr>
+              <w:t>https://github.com/setditjen-psdkp/api-sip/pull/5434</w:t>
             </w:r>
           </w:p>
         </w:tc>
@@ -2483,50 +2524,55 @@
                 <w:rFonts w:ascii="Calibri" w:hAnsi="Calibri"/>
                 <w:sz w:val="18"/>
               </w:rPr>
-            </w:r>
-          </w:p>
-        </w:tc>
-        <w:tc>
-          <w:tcPr/>
-          <w:p>
-            <w:r>
-              <w:rPr>
-                <w:rFonts w:ascii="Calibri" w:hAnsi="Calibri"/>
-                <w:sz w:val="18"/>
-              </w:rPr>
-            </w:r>
-          </w:p>
-        </w:tc>
-        <w:tc>
-          <w:tcPr/>
-          <w:p>
-            <w:r>
-              <w:rPr>
-                <w:rFonts w:ascii="Calibri" w:hAnsi="Calibri"/>
-                <w:sz w:val="18"/>
-              </w:rPr>
-            </w:r>
-          </w:p>
-        </w:tc>
-        <w:tc>
-          <w:tcPr/>
-          <w:p>
-            <w:r>
-              <w:rPr>
-                <w:rFonts w:ascii="Calibri" w:hAnsi="Calibri"/>
-                <w:sz w:val="18"/>
-              </w:rPr>
-            </w:r>
-          </w:p>
-        </w:tc>
-        <w:tc>
-          <w:tcPr/>
-          <w:p>
-            <w:r>
-              <w:rPr>
-                <w:rFonts w:ascii="Calibri" w:hAnsi="Calibri"/>
-                <w:sz w:val="18"/>
-              </w:rPr>
+              <w:t>18</w:t>
+            </w:r>
+          </w:p>
+        </w:tc>
+        <w:tc>
+          <w:tcPr/>
+          <w:p>
+            <w:r>
+              <w:rPr>
+                <w:rFonts w:ascii="Calibri" w:hAnsi="Calibri"/>
+                <w:sz w:val="18"/>
+              </w:rPr>
+              <w:t>Penyesuaian fitur POA pada modul PSDKP Angka</w:t>
+            </w:r>
+          </w:p>
+        </w:tc>
+        <w:tc>
+          <w:tcPr/>
+          <w:p>
+            <w:r>
+              <w:rPr>
+                <w:rFonts w:ascii="Calibri" w:hAnsi="Calibri"/>
+                <w:sz w:val="18"/>
+              </w:rPr>
+              <w:t>Telah diimplementasikan penyesuaian fitur poa pada modul psdkp angka</w:t>
+            </w:r>
+          </w:p>
+        </w:tc>
+        <w:tc>
+          <w:tcPr/>
+          <w:p>
+            <w:r>
+              <w:rPr>
+                <w:rFonts w:ascii="Calibri" w:hAnsi="Calibri"/>
+                <w:sz w:val="18"/>
+              </w:rPr>
+              <w:t>Lutfi</w:t>
+            </w:r>
+          </w:p>
+        </w:tc>
+        <w:tc>
+          <w:tcPr/>
+          <w:p>
+            <w:r>
+              <w:rPr>
+                <w:rFonts w:ascii="Calibri" w:hAnsi="Calibri"/>
+                <w:sz w:val="18"/>
+              </w:rPr>
+              <w:t>https://github.com/setditjen-psdkp/api-sip/pull/5435</w:t>
             </w:r>
           </w:p>
         </w:tc>
@@ -2567,50 +2613,55 @@
                 <w:rFonts w:ascii="Calibri" w:hAnsi="Calibri"/>
                 <w:sz w:val="18"/>
               </w:rPr>
-            </w:r>
-          </w:p>
-        </w:tc>
-        <w:tc>
-          <w:tcPr/>
-          <w:p>
-            <w:r>
-              <w:rPr>
-                <w:rFonts w:ascii="Calibri" w:hAnsi="Calibri"/>
-                <w:sz w:val="18"/>
-              </w:rPr>
-            </w:r>
-          </w:p>
-        </w:tc>
-        <w:tc>
-          <w:tcPr/>
-          <w:p>
-            <w:r>
-              <w:rPr>
-                <w:rFonts w:ascii="Calibri" w:hAnsi="Calibri"/>
-                <w:sz w:val="18"/>
-              </w:rPr>
-            </w:r>
-          </w:p>
-        </w:tc>
-        <w:tc>
-          <w:tcPr/>
-          <w:p>
-            <w:r>
-              <w:rPr>
-                <w:rFonts w:ascii="Calibri" w:hAnsi="Calibri"/>
-                <w:sz w:val="18"/>
-              </w:rPr>
-            </w:r>
-          </w:p>
-        </w:tc>
-        <w:tc>
-          <w:tcPr/>
-          <w:p>
-            <w:r>
-              <w:rPr>
-                <w:rFonts w:ascii="Calibri" w:hAnsi="Calibri"/>
-                <w:sz w:val="18"/>
-              </w:rPr>
+              <w:t>18</w:t>
+            </w:r>
+          </w:p>
+        </w:tc>
+        <w:tc>
+          <w:tcPr/>
+          <w:p>
+            <w:r>
+              <w:rPr>
+                <w:rFonts w:ascii="Calibri" w:hAnsi="Calibri"/>
+                <w:sz w:val="18"/>
+              </w:rPr>
+              <w:t>Menyesuaikan teks label pada kartu informasi di Dashboard Pimpinan</w:t>
+            </w:r>
+          </w:p>
+        </w:tc>
+        <w:tc>
+          <w:tcPr/>
+          <w:p>
+            <w:r>
+              <w:rPr>
+                <w:rFonts w:ascii="Calibri" w:hAnsi="Calibri"/>
+                <w:sz w:val="18"/>
+              </w:rPr>
+              <w:t>Telah diimplementasikan menyesuaikan teks label pada kartu informasi di dashboard pimpinan</w:t>
+            </w:r>
+          </w:p>
+        </w:tc>
+        <w:tc>
+          <w:tcPr/>
+          <w:p>
+            <w:r>
+              <w:rPr>
+                <w:rFonts w:ascii="Calibri" w:hAnsi="Calibri"/>
+                <w:sz w:val="18"/>
+              </w:rPr>
+              <w:t>Lutfi</w:t>
+            </w:r>
+          </w:p>
+        </w:tc>
+        <w:tc>
+          <w:tcPr/>
+          <w:p>
+            <w:r>
+              <w:rPr>
+                <w:rFonts w:ascii="Calibri" w:hAnsi="Calibri"/>
+                <w:sz w:val="18"/>
+              </w:rPr>
+              <w:t>https://github.com/setditjen-psdkp/api-sip/pull/5436</w:t>
             </w:r>
           </w:p>
         </w:tc>
@@ -2651,50 +2702,55 @@
                 <w:rFonts w:ascii="Calibri" w:hAnsi="Calibri"/>
                 <w:sz w:val="18"/>
               </w:rPr>
-            </w:r>
-          </w:p>
-        </w:tc>
-        <w:tc>
-          <w:tcPr/>
-          <w:p>
-            <w:r>
-              <w:rPr>
-                <w:rFonts w:ascii="Calibri" w:hAnsi="Calibri"/>
-                <w:sz w:val="18"/>
-              </w:rPr>
-            </w:r>
-          </w:p>
-        </w:tc>
-        <w:tc>
-          <w:tcPr/>
-          <w:p>
-            <w:r>
-              <w:rPr>
-                <w:rFonts w:ascii="Calibri" w:hAnsi="Calibri"/>
-                <w:sz w:val="18"/>
-              </w:rPr>
-            </w:r>
-          </w:p>
-        </w:tc>
-        <w:tc>
-          <w:tcPr/>
-          <w:p>
-            <w:r>
-              <w:rPr>
-                <w:rFonts w:ascii="Calibri" w:hAnsi="Calibri"/>
-                <w:sz w:val="18"/>
-              </w:rPr>
-            </w:r>
-          </w:p>
-        </w:tc>
-        <w:tc>
-          <w:tcPr/>
-          <w:p>
-            <w:r>
-              <w:rPr>
-                <w:rFonts w:ascii="Calibri" w:hAnsi="Calibri"/>
-                <w:sz w:val="18"/>
-              </w:rPr>
+              <w:t>18</w:t>
+            </w:r>
+          </w:p>
+        </w:tc>
+        <w:tc>
+          <w:tcPr/>
+          <w:p>
+            <w:r>
+              <w:rPr>
+                <w:rFonts w:ascii="Calibri" w:hAnsi="Calibri"/>
+                <w:sz w:val="18"/>
+              </w:rPr>
+              <w:t>Membuat tabel pemeriksaan agar rentang tahunnya otomatis tanpa batasan statis</w:t>
+            </w:r>
+          </w:p>
+        </w:tc>
+        <w:tc>
+          <w:tcPr/>
+          <w:p>
+            <w:r>
+              <w:rPr>
+                <w:rFonts w:ascii="Calibri" w:hAnsi="Calibri"/>
+                <w:sz w:val="18"/>
+              </w:rPr>
+              <w:t>Telah diimplementasikan membuat tabel pemeriksaan agar rentang tahunnya otomatis tanpa batasan statis</w:t>
+            </w:r>
+          </w:p>
+        </w:tc>
+        <w:tc>
+          <w:tcPr/>
+          <w:p>
+            <w:r>
+              <w:rPr>
+                <w:rFonts w:ascii="Calibri" w:hAnsi="Calibri"/>
+                <w:sz w:val="18"/>
+              </w:rPr>
+              <w:t>Lutfi</w:t>
+            </w:r>
+          </w:p>
+        </w:tc>
+        <w:tc>
+          <w:tcPr/>
+          <w:p>
+            <w:r>
+              <w:rPr>
+                <w:rFonts w:ascii="Calibri" w:hAnsi="Calibri"/>
+                <w:sz w:val="18"/>
+              </w:rPr>
+              <w:t>https://github.com/setditjen-psdkp/api-sip/pull/5437</w:t>
             </w:r>
           </w:p>
         </w:tc>
@@ -2734,50 +2790,55 @@
                 <w:rFonts w:ascii="Calibri" w:hAnsi="Calibri"/>
                 <w:sz w:val="18"/>
               </w:rPr>
-            </w:r>
-          </w:p>
-        </w:tc>
-        <w:tc>
-          <w:tcPr/>
-          <w:p>
-            <w:r>
-              <w:rPr>
-                <w:rFonts w:ascii="Calibri" w:hAnsi="Calibri"/>
-                <w:sz w:val="18"/>
-              </w:rPr>
-            </w:r>
-          </w:p>
-        </w:tc>
-        <w:tc>
-          <w:tcPr/>
-          <w:p>
-            <w:r>
-              <w:rPr>
-                <w:rFonts w:ascii="Calibri" w:hAnsi="Calibri"/>
-                <w:sz w:val="18"/>
-              </w:rPr>
-            </w:r>
-          </w:p>
-        </w:tc>
-        <w:tc>
-          <w:tcPr/>
-          <w:p>
-            <w:r>
-              <w:rPr>
-                <w:rFonts w:ascii="Calibri" w:hAnsi="Calibri"/>
-                <w:sz w:val="18"/>
-              </w:rPr>
-            </w:r>
-          </w:p>
-        </w:tc>
-        <w:tc>
-          <w:tcPr/>
-          <w:p>
-            <w:r>
-              <w:rPr>
-                <w:rFonts w:ascii="Calibri" w:hAnsi="Calibri"/>
-                <w:sz w:val="18"/>
-              </w:rPr>
+              <w:t>18</w:t>
+            </w:r>
+          </w:p>
+        </w:tc>
+        <w:tc>
+          <w:tcPr/>
+          <w:p>
+            <w:r>
+              <w:rPr>
+                <w:rFonts w:ascii="Calibri" w:hAnsi="Calibri"/>
+                <w:sz w:val="18"/>
+              </w:rPr>
+              <w:t>Membatasi tampilan grafik dan tabel operasi armada untuk rentang 5 tahun terakhir</w:t>
+            </w:r>
+          </w:p>
+        </w:tc>
+        <w:tc>
+          <w:tcPr/>
+          <w:p>
+            <w:r>
+              <w:rPr>
+                <w:rFonts w:ascii="Calibri" w:hAnsi="Calibri"/>
+                <w:sz w:val="18"/>
+              </w:rPr>
+              <w:t>Telah diimplementasikan membatasi tampilan grafik dan tabel operasi armada untuk rentang 5 tahun terakhir</w:t>
+            </w:r>
+          </w:p>
+        </w:tc>
+        <w:tc>
+          <w:tcPr/>
+          <w:p>
+            <w:r>
+              <w:rPr>
+                <w:rFonts w:ascii="Calibri" w:hAnsi="Calibri"/>
+                <w:sz w:val="18"/>
+              </w:rPr>
+              <w:t>Lutfi</w:t>
+            </w:r>
+          </w:p>
+        </w:tc>
+        <w:tc>
+          <w:tcPr/>
+          <w:p>
+            <w:r>
+              <w:rPr>
+                <w:rFonts w:ascii="Calibri" w:hAnsi="Calibri"/>
+                <w:sz w:val="18"/>
+              </w:rPr>
+              <w:t>https://github.com/setditjen-psdkp/api-sip/pull/5438</w:t>
             </w:r>
           </w:p>
         </w:tc>
@@ -2817,50 +2878,55 @@
                 <w:rFonts w:ascii="Calibri" w:hAnsi="Calibri"/>
                 <w:sz w:val="18"/>
               </w:rPr>
-            </w:r>
-          </w:p>
-        </w:tc>
-        <w:tc>
-          <w:tcPr/>
-          <w:p>
-            <w:r>
-              <w:rPr>
-                <w:rFonts w:ascii="Calibri" w:hAnsi="Calibri"/>
-                <w:sz w:val="18"/>
-              </w:rPr>
-            </w:r>
-          </w:p>
-        </w:tc>
-        <w:tc>
-          <w:tcPr/>
-          <w:p>
-            <w:r>
-              <w:rPr>
-                <w:rFonts w:ascii="Calibri" w:hAnsi="Calibri"/>
-                <w:sz w:val="18"/>
-              </w:rPr>
-            </w:r>
-          </w:p>
-        </w:tc>
-        <w:tc>
-          <w:tcPr/>
-          <w:p>
-            <w:r>
-              <w:rPr>
-                <w:rFonts w:ascii="Calibri" w:hAnsi="Calibri"/>
-                <w:sz w:val="18"/>
-              </w:rPr>
-            </w:r>
-          </w:p>
-        </w:tc>
-        <w:tc>
-          <w:tcPr/>
-          <w:p>
-            <w:r>
-              <w:rPr>
-                <w:rFonts w:ascii="Calibri" w:hAnsi="Calibri"/>
-                <w:sz w:val="18"/>
-              </w:rPr>
+              <w:t>18</w:t>
+            </w:r>
+          </w:p>
+        </w:tc>
+        <w:tc>
+          <w:tcPr/>
+          <w:p>
+            <w:r>
+              <w:rPr>
+                <w:rFonts w:ascii="Calibri" w:hAnsi="Calibri"/>
+                <w:sz w:val="18"/>
+              </w:rPr>
+              <w:t>Membuat tampilan rentang grafik menyesuaikan dengan tahun yang dipilih</w:t>
+            </w:r>
+          </w:p>
+        </w:tc>
+        <w:tc>
+          <w:tcPr/>
+          <w:p>
+            <w:r>
+              <w:rPr>
+                <w:rFonts w:ascii="Calibri" w:hAnsi="Calibri"/>
+                <w:sz w:val="18"/>
+              </w:rPr>
+              <w:t>Telah diimplementasikan membuat tampilan rentang grafik menyesuaikan dengan tahun yang dipilih</w:t>
+            </w:r>
+          </w:p>
+        </w:tc>
+        <w:tc>
+          <w:tcPr/>
+          <w:p>
+            <w:r>
+              <w:rPr>
+                <w:rFonts w:ascii="Calibri" w:hAnsi="Calibri"/>
+                <w:sz w:val="18"/>
+              </w:rPr>
+              <w:t>Lutfi</w:t>
+            </w:r>
+          </w:p>
+        </w:tc>
+        <w:tc>
+          <w:tcPr/>
+          <w:p>
+            <w:r>
+              <w:rPr>
+                <w:rFonts w:ascii="Calibri" w:hAnsi="Calibri"/>
+                <w:sz w:val="18"/>
+              </w:rPr>
+              <w:t>https://github.com/setditjen-psdkp/api-sip/pull/5439</w:t>
             </w:r>
           </w:p>
         </w:tc>
@@ -2900,50 +2966,55 @@
                 <w:rFonts w:ascii="Calibri" w:hAnsi="Calibri"/>
                 <w:sz w:val="18"/>
               </w:rPr>
-            </w:r>
-          </w:p>
-        </w:tc>
-        <w:tc>
-          <w:tcPr/>
-          <w:p>
-            <w:r>
-              <w:rPr>
-                <w:rFonts w:ascii="Calibri" w:hAnsi="Calibri"/>
-                <w:sz w:val="18"/>
-              </w:rPr>
-            </w:r>
-          </w:p>
-        </w:tc>
-        <w:tc>
-          <w:tcPr/>
-          <w:p>
-            <w:r>
-              <w:rPr>
-                <w:rFonts w:ascii="Calibri" w:hAnsi="Calibri"/>
-                <w:sz w:val="18"/>
-              </w:rPr>
-            </w:r>
-          </w:p>
-        </w:tc>
-        <w:tc>
-          <w:tcPr/>
-          <w:p>
-            <w:r>
-              <w:rPr>
-                <w:rFonts w:ascii="Calibri" w:hAnsi="Calibri"/>
-                <w:sz w:val="18"/>
-              </w:rPr>
-            </w:r>
-          </w:p>
-        </w:tc>
-        <w:tc>
-          <w:tcPr/>
-          <w:p>
-            <w:r>
-              <w:rPr>
-                <w:rFonts w:ascii="Calibri" w:hAnsi="Calibri"/>
-                <w:sz w:val="18"/>
-              </w:rPr>
+              <w:t>18</w:t>
+            </w:r>
+          </w:p>
+        </w:tc>
+        <w:tc>
+          <w:tcPr/>
+          <w:p>
+            <w:r>
+              <w:rPr>
+                <w:rFonts w:ascii="Calibri" w:hAnsi="Calibri"/>
+                <w:sz w:val="18"/>
+              </w:rPr>
+              <w:t>Membatasi rentang data riwayat dan perbandingan untuk 5 tahun terakhir secara otomatis</w:t>
+            </w:r>
+          </w:p>
+        </w:tc>
+        <w:tc>
+          <w:tcPr/>
+          <w:p>
+            <w:r>
+              <w:rPr>
+                <w:rFonts w:ascii="Calibri" w:hAnsi="Calibri"/>
+                <w:sz w:val="18"/>
+              </w:rPr>
+              <w:t>Telah diimplementasikan membatasi rentang data riwayat dan perbandingan untuk 5 tahun terakhir secara otomatis</w:t>
+            </w:r>
+          </w:p>
+        </w:tc>
+        <w:tc>
+          <w:tcPr/>
+          <w:p>
+            <w:r>
+              <w:rPr>
+                <w:rFonts w:ascii="Calibri" w:hAnsi="Calibri"/>
+                <w:sz w:val="18"/>
+              </w:rPr>
+              <w:t>Lutfi</w:t>
+            </w:r>
+          </w:p>
+        </w:tc>
+        <w:tc>
+          <w:tcPr/>
+          <w:p>
+            <w:r>
+              <w:rPr>
+                <w:rFonts w:ascii="Calibri" w:hAnsi="Calibri"/>
+                <w:sz w:val="18"/>
+              </w:rPr>
+              <w:t>https://github.com/setditjen-psdkp/api-sip/pull/5440</w:t>
             </w:r>
           </w:p>
         </w:tc>
@@ -2983,50 +3054,55 @@
                 <w:rFonts w:ascii="Calibri" w:hAnsi="Calibri"/>
                 <w:sz w:val="18"/>
               </w:rPr>
-            </w:r>
-          </w:p>
-        </w:tc>
-        <w:tc>
-          <w:tcPr/>
-          <w:p>
-            <w:r>
-              <w:rPr>
-                <w:rFonts w:ascii="Calibri" w:hAnsi="Calibri"/>
-                <w:sz w:val="18"/>
-              </w:rPr>
-            </w:r>
-          </w:p>
-        </w:tc>
-        <w:tc>
-          <w:tcPr/>
-          <w:p>
-            <w:r>
-              <w:rPr>
-                <w:rFonts w:ascii="Calibri" w:hAnsi="Calibri"/>
-                <w:sz w:val="18"/>
-              </w:rPr>
-            </w:r>
-          </w:p>
-        </w:tc>
-        <w:tc>
-          <w:tcPr/>
-          <w:p>
-            <w:r>
-              <w:rPr>
-                <w:rFonts w:ascii="Calibri" w:hAnsi="Calibri"/>
-                <w:sz w:val="18"/>
-              </w:rPr>
-            </w:r>
-          </w:p>
-        </w:tc>
-        <w:tc>
-          <w:tcPr/>
-          <w:p>
-            <w:r>
-              <w:rPr>
-                <w:rFonts w:ascii="Calibri" w:hAnsi="Calibri"/>
-                <w:sz w:val="18"/>
-              </w:rPr>
+              <w:t>18</w:t>
+            </w:r>
+          </w:p>
+        </w:tc>
+        <w:tc>
+          <w:tcPr/>
+          <w:p>
+            <w:r>
+              <w:rPr>
+                <w:rFonts w:ascii="Calibri" w:hAnsi="Calibri"/>
+                <w:sz w:val="18"/>
+              </w:rPr>
+              <w:t>Membersihkan teks label yang tidak diperlukan pada layanan pengawasan</w:t>
+            </w:r>
+          </w:p>
+        </w:tc>
+        <w:tc>
+          <w:tcPr/>
+          <w:p>
+            <w:r>
+              <w:rPr>
+                <w:rFonts w:ascii="Calibri" w:hAnsi="Calibri"/>
+                <w:sz w:val="18"/>
+              </w:rPr>
+              <w:t>Telah diimplementasikan membersihkan teks label yang tidak diperlukan pada layanan pengawasan</w:t>
+            </w:r>
+          </w:p>
+        </w:tc>
+        <w:tc>
+          <w:tcPr/>
+          <w:p>
+            <w:r>
+              <w:rPr>
+                <w:rFonts w:ascii="Calibri" w:hAnsi="Calibri"/>
+                <w:sz w:val="18"/>
+              </w:rPr>
+              <w:t>Lutfi</w:t>
+            </w:r>
+          </w:p>
+        </w:tc>
+        <w:tc>
+          <w:tcPr/>
+          <w:p>
+            <w:r>
+              <w:rPr>
+                <w:rFonts w:ascii="Calibri" w:hAnsi="Calibri"/>
+                <w:sz w:val="18"/>
+              </w:rPr>
+              <w:t>https://github.com/setditjen-psdkp/api-sip/pull/5441</w:t>
             </w:r>
           </w:p>
         </w:tc>
@@ -3066,50 +3142,55 @@
                 <w:rFonts w:ascii="Calibri" w:hAnsi="Calibri"/>
                 <w:sz w:val="18"/>
               </w:rPr>
-            </w:r>
-          </w:p>
-        </w:tc>
-        <w:tc>
-          <w:tcPr/>
-          <w:p>
-            <w:r>
-              <w:rPr>
-                <w:rFonts w:ascii="Calibri" w:hAnsi="Calibri"/>
-                <w:sz w:val="18"/>
-              </w:rPr>
-            </w:r>
-          </w:p>
-        </w:tc>
-        <w:tc>
-          <w:tcPr/>
-          <w:p>
-            <w:r>
-              <w:rPr>
-                <w:rFonts w:ascii="Calibri" w:hAnsi="Calibri"/>
-                <w:sz w:val="18"/>
-              </w:rPr>
-            </w:r>
-          </w:p>
-        </w:tc>
-        <w:tc>
-          <w:tcPr/>
-          <w:p>
-            <w:r>
-              <w:rPr>
-                <w:rFonts w:ascii="Calibri" w:hAnsi="Calibri"/>
-                <w:sz w:val="18"/>
-              </w:rPr>
-            </w:r>
-          </w:p>
-        </w:tc>
-        <w:tc>
-          <w:tcPr/>
-          <w:p>
-            <w:r>
-              <w:rPr>
-                <w:rFonts w:ascii="Calibri" w:hAnsi="Calibri"/>
-                <w:sz w:val="18"/>
-              </w:rPr>
+              <w:t>18</w:t>
+            </w:r>
+          </w:p>
+        </w:tc>
+        <w:tc>
+          <w:tcPr/>
+          <w:p>
+            <w:r>
+              <w:rPr>
+                <w:rFonts w:ascii="Calibri" w:hAnsi="Calibri"/>
+                <w:sz w:val="18"/>
+              </w:rPr>
+              <w:t>Menyesuaikan penamaan file unduhan agar sesuai dengan jenis datanya</w:t>
+            </w:r>
+          </w:p>
+        </w:tc>
+        <w:tc>
+          <w:tcPr/>
+          <w:p>
+            <w:r>
+              <w:rPr>
+                <w:rFonts w:ascii="Calibri" w:hAnsi="Calibri"/>
+                <w:sz w:val="18"/>
+              </w:rPr>
+              <w:t>Telah diimplementasikan menyesuaikan penamaan file unduhan agar sesuai dengan jenis datanya</w:t>
+            </w:r>
+          </w:p>
+        </w:tc>
+        <w:tc>
+          <w:tcPr/>
+          <w:p>
+            <w:r>
+              <w:rPr>
+                <w:rFonts w:ascii="Calibri" w:hAnsi="Calibri"/>
+                <w:sz w:val="18"/>
+              </w:rPr>
+              <w:t>Lutfi</w:t>
+            </w:r>
+          </w:p>
+        </w:tc>
+        <w:tc>
+          <w:tcPr/>
+          <w:p>
+            <w:r>
+              <w:rPr>
+                <w:rFonts w:ascii="Calibri" w:hAnsi="Calibri"/>
+                <w:sz w:val="18"/>
+              </w:rPr>
+              <w:t>https://github.com/setditjen-psdkp/api-sip/pull/5442</w:t>
             </w:r>
           </w:p>
         </w:tc>
@@ -3149,50 +3230,55 @@
                 <w:rFonts w:ascii="Calibri" w:hAnsi="Calibri"/>
                 <w:sz w:val="18"/>
               </w:rPr>
-            </w:r>
-          </w:p>
-        </w:tc>
-        <w:tc>
-          <w:tcPr/>
-          <w:p>
-            <w:r>
-              <w:rPr>
-                <w:rFonts w:ascii="Calibri" w:hAnsi="Calibri"/>
-                <w:sz w:val="18"/>
-              </w:rPr>
-            </w:r>
-          </w:p>
-        </w:tc>
-        <w:tc>
-          <w:tcPr/>
-          <w:p>
-            <w:r>
-              <w:rPr>
-                <w:rFonts w:ascii="Calibri" w:hAnsi="Calibri"/>
-                <w:sz w:val="18"/>
-              </w:rPr>
-            </w:r>
-          </w:p>
-        </w:tc>
-        <w:tc>
-          <w:tcPr/>
-          <w:p>
-            <w:r>
-              <w:rPr>
-                <w:rFonts w:ascii="Calibri" w:hAnsi="Calibri"/>
-                <w:sz w:val="18"/>
-              </w:rPr>
-            </w:r>
-          </w:p>
-        </w:tc>
-        <w:tc>
-          <w:tcPr/>
-          <w:p>
-            <w:r>
-              <w:rPr>
-                <w:rFonts w:ascii="Calibri" w:hAnsi="Calibri"/>
-                <w:sz w:val="18"/>
-              </w:rPr>
+              <w:t>18</w:t>
+            </w:r>
+          </w:p>
+        </w:tc>
+        <w:tc>
+          <w:tcPr/>
+          <w:p>
+            <w:r>
+              <w:rPr>
+                <w:rFonts w:ascii="Calibri" w:hAnsi="Calibri"/>
+                <w:sz w:val="18"/>
+              </w:rPr>
+              <w:t>Memperbarui data pada modul PSDKP Angka</w:t>
+            </w:r>
+          </w:p>
+        </w:tc>
+        <w:tc>
+          <w:tcPr/>
+          <w:p>
+            <w:r>
+              <w:rPr>
+                <w:rFonts w:ascii="Calibri" w:hAnsi="Calibri"/>
+                <w:sz w:val="18"/>
+              </w:rPr>
+              <w:t>Telah diimplementasikan memperbarui data pada modul psdkp angka</w:t>
+            </w:r>
+          </w:p>
+        </w:tc>
+        <w:tc>
+          <w:tcPr/>
+          <w:p>
+            <w:r>
+              <w:rPr>
+                <w:rFonts w:ascii="Calibri" w:hAnsi="Calibri"/>
+                <w:sz w:val="18"/>
+              </w:rPr>
+              <w:t>Lutfi</w:t>
+            </w:r>
+          </w:p>
+        </w:tc>
+        <w:tc>
+          <w:tcPr/>
+          <w:p>
+            <w:r>
+              <w:rPr>
+                <w:rFonts w:ascii="Calibri" w:hAnsi="Calibri"/>
+                <w:sz w:val="18"/>
+              </w:rPr>
+              <w:t>https://github.com/setditjen-psdkp/api-sip/pull/5444</w:t>
             </w:r>
           </w:p>
         </w:tc>
@@ -3232,50 +3318,55 @@
                 <w:rFonts w:ascii="Calibri" w:hAnsi="Calibri"/>
                 <w:sz w:val="18"/>
               </w:rPr>
-            </w:r>
-          </w:p>
-        </w:tc>
-        <w:tc>
-          <w:tcPr/>
-          <w:p>
-            <w:r>
-              <w:rPr>
-                <w:rFonts w:ascii="Calibri" w:hAnsi="Calibri"/>
-                <w:sz w:val="18"/>
-              </w:rPr>
-            </w:r>
-          </w:p>
-        </w:tc>
-        <w:tc>
-          <w:tcPr/>
-          <w:p>
-            <w:r>
-              <w:rPr>
-                <w:rFonts w:ascii="Calibri" w:hAnsi="Calibri"/>
-                <w:sz w:val="18"/>
-              </w:rPr>
-            </w:r>
-          </w:p>
-        </w:tc>
-        <w:tc>
-          <w:tcPr/>
-          <w:p>
-            <w:r>
-              <w:rPr>
-                <w:rFonts w:ascii="Calibri" w:hAnsi="Calibri"/>
-                <w:sz w:val="18"/>
-              </w:rPr>
-            </w:r>
-          </w:p>
-        </w:tc>
-        <w:tc>
-          <w:tcPr/>
-          <w:p>
-            <w:r>
-              <w:rPr>
-                <w:rFonts w:ascii="Calibri" w:hAnsi="Calibri"/>
-                <w:sz w:val="18"/>
-              </w:rPr>
+              <w:t>18</w:t>
+            </w:r>
+          </w:p>
+        </w:tc>
+        <w:tc>
+          <w:tcPr/>
+          <w:p>
+            <w:r>
+              <w:rPr>
+                <w:rFonts w:ascii="Calibri" w:hAnsi="Calibri"/>
+                <w:sz w:val="18"/>
+              </w:rPr>
+              <w:t>Memperbaiki validitas data asal pada modul PSDKP Angka</w:t>
+            </w:r>
+          </w:p>
+        </w:tc>
+        <w:tc>
+          <w:tcPr/>
+          <w:p>
+            <w:r>
+              <w:rPr>
+                <w:rFonts w:ascii="Calibri" w:hAnsi="Calibri"/>
+                <w:sz w:val="18"/>
+              </w:rPr>
+              <w:t>Telah diimplementasikan memperbaiki validitas data asal pada modul psdkp angka</w:t>
+            </w:r>
+          </w:p>
+        </w:tc>
+        <w:tc>
+          <w:tcPr/>
+          <w:p>
+            <w:r>
+              <w:rPr>
+                <w:rFonts w:ascii="Calibri" w:hAnsi="Calibri"/>
+                <w:sz w:val="18"/>
+              </w:rPr>
+              <w:t>Lutfi</w:t>
+            </w:r>
+          </w:p>
+        </w:tc>
+        <w:tc>
+          <w:tcPr/>
+          <w:p>
+            <w:r>
+              <w:rPr>
+                <w:rFonts w:ascii="Calibri" w:hAnsi="Calibri"/>
+                <w:sz w:val="18"/>
+              </w:rPr>
+              <w:t>https://github.com/setditjen-psdkp/api-sip/pull/5445</w:t>
             </w:r>
           </w:p>
         </w:tc>
@@ -3315,50 +3406,55 @@
                 <w:rFonts w:ascii="Calibri" w:hAnsi="Calibri"/>
                 <w:sz w:val="18"/>
               </w:rPr>
-            </w:r>
-          </w:p>
-        </w:tc>
-        <w:tc>
-          <w:tcPr/>
-          <w:p>
-            <w:r>
-              <w:rPr>
-                <w:rFonts w:ascii="Calibri" w:hAnsi="Calibri"/>
-                <w:sz w:val="18"/>
-              </w:rPr>
-            </w:r>
-          </w:p>
-        </w:tc>
-        <w:tc>
-          <w:tcPr/>
-          <w:p>
-            <w:r>
-              <w:rPr>
-                <w:rFonts w:ascii="Calibri" w:hAnsi="Calibri"/>
-                <w:sz w:val="18"/>
-              </w:rPr>
-            </w:r>
-          </w:p>
-        </w:tc>
-        <w:tc>
-          <w:tcPr/>
-          <w:p>
-            <w:r>
-              <w:rPr>
-                <w:rFonts w:ascii="Calibri" w:hAnsi="Calibri"/>
-                <w:sz w:val="18"/>
-              </w:rPr>
-            </w:r>
-          </w:p>
-        </w:tc>
-        <w:tc>
-          <w:tcPr/>
-          <w:p>
-            <w:r>
-              <w:rPr>
-                <w:rFonts w:ascii="Calibri" w:hAnsi="Calibri"/>
-                <w:sz w:val="18"/>
-              </w:rPr>
+              <w:t>18</w:t>
+            </w:r>
+          </w:p>
+        </w:tc>
+        <w:tc>
+          <w:tcPr/>
+          <w:p>
+            <w:r>
+              <w:rPr>
+                <w:rFonts w:ascii="Calibri" w:hAnsi="Calibri"/>
+                <w:sz w:val="18"/>
+              </w:rPr>
+              <w:t>Memulihkan dan menyesuaikan ulang data operasi armada tahun 2026</w:t>
+            </w:r>
+          </w:p>
+        </w:tc>
+        <w:tc>
+          <w:tcPr/>
+          <w:p>
+            <w:r>
+              <w:rPr>
+                <w:rFonts w:ascii="Calibri" w:hAnsi="Calibri"/>
+                <w:sz w:val="18"/>
+              </w:rPr>
+              <w:t>Telah diimplementasikan memulihkan dan menyesuaikan ulang data operasi armada tahun 2026</w:t>
+            </w:r>
+          </w:p>
+        </w:tc>
+        <w:tc>
+          <w:tcPr/>
+          <w:p>
+            <w:r>
+              <w:rPr>
+                <w:rFonts w:ascii="Calibri" w:hAnsi="Calibri"/>
+                <w:sz w:val="18"/>
+              </w:rPr>
+              <w:t>Lutfi</w:t>
+            </w:r>
+          </w:p>
+        </w:tc>
+        <w:tc>
+          <w:tcPr/>
+          <w:p>
+            <w:r>
+              <w:rPr>
+                <w:rFonts w:ascii="Calibri" w:hAnsi="Calibri"/>
+                <w:sz w:val="18"/>
+              </w:rPr>
+              <w:t>https://github.com/setditjen-psdkp/api-sip/pull/5446</w:t>
             </w:r>
           </w:p>
         </w:tc>
@@ -3376,73 +3472,77 @@
                 <w:rFonts w:ascii="Calibri" w:hAnsi="Calibri"/>
                 <w:sz w:val="18"/>
               </w:rPr>
-              <w:t>W4</w:t>
-            </w:r>
-          </w:p>
-        </w:tc>
-        <w:tc>
-          <w:tcPr/>
-          <w:p>
-            <w:r>
-              <w:rPr>
-                <w:rFonts w:ascii="Calibri" w:hAnsi="Calibri"/>
-                <w:sz w:val="18"/>
-              </w:rPr>
-            </w:r>
-          </w:p>
-        </w:tc>
-        <w:tc>
-          <w:tcPr/>
-          <w:p>
-            <w:r>
-              <w:rPr>
-                <w:rFonts w:ascii="Calibri" w:hAnsi="Calibri"/>
-                <w:sz w:val="18"/>
-              </w:rPr>
-            </w:r>
-          </w:p>
-        </w:tc>
-        <w:tc>
-          <w:tcPr/>
-          <w:p>
-            <w:r>
-              <w:rPr>
-                <w:rFonts w:ascii="Calibri" w:hAnsi="Calibri"/>
-                <w:sz w:val="18"/>
-              </w:rPr>
-            </w:r>
-          </w:p>
-        </w:tc>
-        <w:tc>
-          <w:tcPr/>
-          <w:p>
-            <w:r>
-              <w:rPr>
-                <w:rFonts w:ascii="Calibri" w:hAnsi="Calibri"/>
-                <w:sz w:val="18"/>
-              </w:rPr>
-            </w:r>
-          </w:p>
-        </w:tc>
-        <w:tc>
-          <w:tcPr/>
-          <w:p>
-            <w:r>
-              <w:rPr>
-                <w:rFonts w:ascii="Calibri" w:hAnsi="Calibri"/>
-                <w:sz w:val="18"/>
-              </w:rPr>
-            </w:r>
-          </w:p>
-        </w:tc>
-        <w:tc>
-          <w:tcPr/>
-          <w:p>
-            <w:r>
-              <w:rPr>
-                <w:rFonts w:ascii="Calibri" w:hAnsi="Calibri"/>
-                <w:sz w:val="18"/>
-              </w:rPr>
+            </w:r>
+          </w:p>
+        </w:tc>
+        <w:tc>
+          <w:tcPr/>
+          <w:p>
+            <w:r>
+              <w:rPr>
+                <w:rFonts w:ascii="Calibri" w:hAnsi="Calibri"/>
+                <w:sz w:val="18"/>
+              </w:rPr>
+            </w:r>
+          </w:p>
+        </w:tc>
+        <w:tc>
+          <w:tcPr/>
+          <w:p>
+            <w:r>
+              <w:rPr>
+                <w:rFonts w:ascii="Calibri" w:hAnsi="Calibri"/>
+                <w:sz w:val="18"/>
+              </w:rPr>
+              <w:t>18</w:t>
+            </w:r>
+          </w:p>
+        </w:tc>
+        <w:tc>
+          <w:tcPr/>
+          <w:p>
+            <w:r>
+              <w:rPr>
+                <w:rFonts w:ascii="Calibri" w:hAnsi="Calibri"/>
+                <w:sz w:val="18"/>
+              </w:rPr>
+              <w:t>Penyesuaian fitur modul PSDKP Angka</w:t>
+            </w:r>
+          </w:p>
+        </w:tc>
+        <w:tc>
+          <w:tcPr/>
+          <w:p>
+            <w:r>
+              <w:rPr>
+                <w:rFonts w:ascii="Calibri" w:hAnsi="Calibri"/>
+                <w:sz w:val="18"/>
+              </w:rPr>
+              <w:t>Telah diimplementasikan penyesuaian fitur modul psdkp angka</w:t>
+            </w:r>
+          </w:p>
+        </w:tc>
+        <w:tc>
+          <w:tcPr/>
+          <w:p>
+            <w:r>
+              <w:rPr>
+                <w:rFonts w:ascii="Calibri" w:hAnsi="Calibri"/>
+                <w:sz w:val="18"/>
+              </w:rPr>
+              <w:t>Lutfi</w:t>
+            </w:r>
+          </w:p>
+        </w:tc>
+        <w:tc>
+          <w:tcPr/>
+          <w:p>
+            <w:r>
+              <w:rPr>
+                <w:rFonts w:ascii="Calibri" w:hAnsi="Calibri"/>
+                <w:sz w:val="18"/>
+              </w:rPr>
+              <w:t>https://github.com/setditjen-psdkp/api-sip/pull/5447</w:t>
             </w:r>
           </w:p>
         </w:tc>
@@ -3482,50 +3582,55 @@
                 <w:rFonts w:ascii="Calibri" w:hAnsi="Calibri"/>
                 <w:sz w:val="18"/>
               </w:rPr>
-            </w:r>
-          </w:p>
-        </w:tc>
-        <w:tc>
-          <w:tcPr/>
-          <w:p>
-            <w:r>
-              <w:rPr>
-                <w:rFonts w:ascii="Calibri" w:hAnsi="Calibri"/>
-                <w:sz w:val="18"/>
-              </w:rPr>
-            </w:r>
-          </w:p>
-        </w:tc>
-        <w:tc>
-          <w:tcPr/>
-          <w:p>
-            <w:r>
-              <w:rPr>
-                <w:rFonts w:ascii="Calibri" w:hAnsi="Calibri"/>
-                <w:sz w:val="18"/>
-              </w:rPr>
-            </w:r>
-          </w:p>
-        </w:tc>
-        <w:tc>
-          <w:tcPr/>
-          <w:p>
-            <w:r>
-              <w:rPr>
-                <w:rFonts w:ascii="Calibri" w:hAnsi="Calibri"/>
-                <w:sz w:val="18"/>
-              </w:rPr>
-            </w:r>
-          </w:p>
-        </w:tc>
-        <w:tc>
-          <w:tcPr/>
-          <w:p>
-            <w:r>
-              <w:rPr>
-                <w:rFonts w:ascii="Calibri" w:hAnsi="Calibri"/>
-                <w:sz w:val="18"/>
-              </w:rPr>
+              <w:t>18</w:t>
+            </w:r>
+          </w:p>
+        </w:tc>
+        <w:tc>
+          <w:tcPr/>
+          <w:p>
+            <w:r>
+              <w:rPr>
+                <w:rFonts w:ascii="Calibri" w:hAnsi="Calibri"/>
+                <w:sz w:val="18"/>
+              </w:rPr>
+              <w:t>Mengintegrasikan data dashboard speedboat ke dalam format sistem</w:t>
+            </w:r>
+          </w:p>
+        </w:tc>
+        <w:tc>
+          <w:tcPr/>
+          <w:p>
+            <w:r>
+              <w:rPr>
+                <w:rFonts w:ascii="Calibri" w:hAnsi="Calibri"/>
+                <w:sz w:val="18"/>
+              </w:rPr>
+              <w:t>Telah diimplementasikan mengintegrasikan data dashboard speedboat ke dalam format sistem</w:t>
+            </w:r>
+          </w:p>
+        </w:tc>
+        <w:tc>
+          <w:tcPr/>
+          <w:p>
+            <w:r>
+              <w:rPr>
+                <w:rFonts w:ascii="Calibri" w:hAnsi="Calibri"/>
+                <w:sz w:val="18"/>
+              </w:rPr>
+              <w:t>Lutfi</w:t>
+            </w:r>
+          </w:p>
+        </w:tc>
+        <w:tc>
+          <w:tcPr/>
+          <w:p>
+            <w:r>
+              <w:rPr>
+                <w:rFonts w:ascii="Calibri" w:hAnsi="Calibri"/>
+                <w:sz w:val="18"/>
+              </w:rPr>
+              <w:t>https://github.com/setditjen-psdkp/api-sip/pull/5448</w:t>
             </w:r>
           </w:p>
         </w:tc>
@@ -3565,50 +3670,55 @@
                 <w:rFonts w:ascii="Calibri" w:hAnsi="Calibri"/>
                 <w:sz w:val="18"/>
               </w:rPr>
-            </w:r>
-          </w:p>
-        </w:tc>
-        <w:tc>
-          <w:tcPr/>
-          <w:p>
-            <w:r>
-              <w:rPr>
-                <w:rFonts w:ascii="Calibri" w:hAnsi="Calibri"/>
-                <w:sz w:val="18"/>
-              </w:rPr>
-            </w:r>
-          </w:p>
-        </w:tc>
-        <w:tc>
-          <w:tcPr/>
-          <w:p>
-            <w:r>
-              <w:rPr>
-                <w:rFonts w:ascii="Calibri" w:hAnsi="Calibri"/>
-                <w:sz w:val="18"/>
-              </w:rPr>
-            </w:r>
-          </w:p>
-        </w:tc>
-        <w:tc>
-          <w:tcPr/>
-          <w:p>
-            <w:r>
-              <w:rPr>
-                <w:rFonts w:ascii="Calibri" w:hAnsi="Calibri"/>
-                <w:sz w:val="18"/>
-              </w:rPr>
-            </w:r>
-          </w:p>
-        </w:tc>
-        <w:tc>
-          <w:tcPr/>
-          <w:p>
-            <w:r>
-              <w:rPr>
-                <w:rFonts w:ascii="Calibri" w:hAnsi="Calibri"/>
-                <w:sz w:val="18"/>
-              </w:rPr>
+              <w:t>18</w:t>
+            </w:r>
+          </w:p>
+        </w:tc>
+        <w:tc>
+          <w:tcPr/>
+          <w:p>
+            <w:r>
+              <w:rPr>
+                <w:rFonts w:ascii="Calibri" w:hAnsi="Calibri"/>
+                <w:sz w:val="18"/>
+              </w:rPr>
+              <w:t>Menyiapkan data awal untuk dashboard speedboat</w:t>
+            </w:r>
+          </w:p>
+        </w:tc>
+        <w:tc>
+          <w:tcPr/>
+          <w:p>
+            <w:r>
+              <w:rPr>
+                <w:rFonts w:ascii="Calibri" w:hAnsi="Calibri"/>
+                <w:sz w:val="18"/>
+              </w:rPr>
+              <w:t>Telah diimplementasikan menyiapkan data awal untuk dashboard speedboat</w:t>
+            </w:r>
+          </w:p>
+        </w:tc>
+        <w:tc>
+          <w:tcPr/>
+          <w:p>
+            <w:r>
+              <w:rPr>
+                <w:rFonts w:ascii="Calibri" w:hAnsi="Calibri"/>
+                <w:sz w:val="18"/>
+              </w:rPr>
+              <w:t>Lutfi</w:t>
+            </w:r>
+          </w:p>
+        </w:tc>
+        <w:tc>
+          <w:tcPr/>
+          <w:p>
+            <w:r>
+              <w:rPr>
+                <w:rFonts w:ascii="Calibri" w:hAnsi="Calibri"/>
+                <w:sz w:val="18"/>
+              </w:rPr>
+              <w:t>https://github.com/setditjen-psdkp/api-sip/pull/5449</w:t>
             </w:r>
           </w:p>
         </w:tc>
@@ -3648,50 +3758,55 @@
                 <w:rFonts w:ascii="Calibri" w:hAnsi="Calibri"/>
                 <w:sz w:val="18"/>
               </w:rPr>
-            </w:r>
-          </w:p>
-        </w:tc>
-        <w:tc>
-          <w:tcPr/>
-          <w:p>
-            <w:r>
-              <w:rPr>
-                <w:rFonts w:ascii="Calibri" w:hAnsi="Calibri"/>
-                <w:sz w:val="18"/>
-              </w:rPr>
-            </w:r>
-          </w:p>
-        </w:tc>
-        <w:tc>
-          <w:tcPr/>
-          <w:p>
-            <w:r>
-              <w:rPr>
-                <w:rFonts w:ascii="Calibri" w:hAnsi="Calibri"/>
-                <w:sz w:val="18"/>
-              </w:rPr>
-            </w:r>
-          </w:p>
-        </w:tc>
-        <w:tc>
-          <w:tcPr/>
-          <w:p>
-            <w:r>
-              <w:rPr>
-                <w:rFonts w:ascii="Calibri" w:hAnsi="Calibri"/>
-                <w:sz w:val="18"/>
-              </w:rPr>
-            </w:r>
-          </w:p>
-        </w:tc>
-        <w:tc>
-          <w:tcPr/>
-          <w:p>
-            <w:r>
-              <w:rPr>
-                <w:rFonts w:ascii="Calibri" w:hAnsi="Calibri"/>
-                <w:sz w:val="18"/>
-              </w:rPr>
+              <w:t>18</w:t>
+            </w:r>
+          </w:p>
+        </w:tc>
+        <w:tc>
+          <w:tcPr/>
+          <w:p>
+            <w:r>
+              <w:rPr>
+                <w:rFonts w:ascii="Calibri" w:hAnsi="Calibri"/>
+                <w:sz w:val="18"/>
+              </w:rPr>
+              <w:t>Menyelesaikan beberapa kendala tampilan dan data pada Dashboard Pimpinan</w:t>
+            </w:r>
+          </w:p>
+        </w:tc>
+        <w:tc>
+          <w:tcPr/>
+          <w:p>
+            <w:r>
+              <w:rPr>
+                <w:rFonts w:ascii="Calibri" w:hAnsi="Calibri"/>
+                <w:sz w:val="18"/>
+              </w:rPr>
+              <w:t>Telah diimplementasikan menyelesaikan beberapa kendala tampilan dan data pada dashboard pimpinan</w:t>
+            </w:r>
+          </w:p>
+        </w:tc>
+        <w:tc>
+          <w:tcPr/>
+          <w:p>
+            <w:r>
+              <w:rPr>
+                <w:rFonts w:ascii="Calibri" w:hAnsi="Calibri"/>
+                <w:sz w:val="18"/>
+              </w:rPr>
+              <w:t>Lutfi</w:t>
+            </w:r>
+          </w:p>
+        </w:tc>
+        <w:tc>
+          <w:tcPr/>
+          <w:p>
+            <w:r>
+              <w:rPr>
+                <w:rFonts w:ascii="Calibri" w:hAnsi="Calibri"/>
+                <w:sz w:val="18"/>
+              </w:rPr>
+              <w:t>https://github.com/setditjen-psdkp/api-sip/pull/5450</w:t>
             </w:r>
           </w:p>
         </w:tc>
@@ -3731,50 +3846,55 @@
                 <w:rFonts w:ascii="Calibri" w:hAnsi="Calibri"/>
                 <w:sz w:val="18"/>
               </w:rPr>
-            </w:r>
-          </w:p>
-        </w:tc>
-        <w:tc>
-          <w:tcPr/>
-          <w:p>
-            <w:r>
-              <w:rPr>
-                <w:rFonts w:ascii="Calibri" w:hAnsi="Calibri"/>
-                <w:sz w:val="18"/>
-              </w:rPr>
-            </w:r>
-          </w:p>
-        </w:tc>
-        <w:tc>
-          <w:tcPr/>
-          <w:p>
-            <w:r>
-              <w:rPr>
-                <w:rFonts w:ascii="Calibri" w:hAnsi="Calibri"/>
-                <w:sz w:val="18"/>
-              </w:rPr>
-            </w:r>
-          </w:p>
-        </w:tc>
-        <w:tc>
-          <w:tcPr/>
-          <w:p>
-            <w:r>
-              <w:rPr>
-                <w:rFonts w:ascii="Calibri" w:hAnsi="Calibri"/>
-                <w:sz w:val="18"/>
-              </w:rPr>
-            </w:r>
-          </w:p>
-        </w:tc>
-        <w:tc>
-          <w:tcPr/>
-          <w:p>
-            <w:r>
-              <w:rPr>
-                <w:rFonts w:ascii="Calibri" w:hAnsi="Calibri"/>
-                <w:sz w:val="18"/>
-              </w:rPr>
+              <w:t>19</w:t>
+            </w:r>
+          </w:p>
+        </w:tc>
+        <w:tc>
+          <w:tcPr/>
+          <w:p>
+            <w:r>
+              <w:rPr>
+                <w:rFonts w:ascii="Calibri" w:hAnsi="Calibri"/>
+                <w:sz w:val="18"/>
+              </w:rPr>
+              <w:t>Mengonfigurasi fitur obrolan (chat) backend dan mengatasi kendala jaringan</w:t>
+            </w:r>
+          </w:p>
+        </w:tc>
+        <w:tc>
+          <w:tcPr/>
+          <w:p>
+            <w:r>
+              <w:rPr>
+                <w:rFonts w:ascii="Calibri" w:hAnsi="Calibri"/>
+                <w:sz w:val="18"/>
+              </w:rPr>
+              <w:t>Telah diimplementasikan mengonfigurasi fitur obrolan (chat) backend dan mengatasi kendala jaringan</w:t>
+            </w:r>
+          </w:p>
+        </w:tc>
+        <w:tc>
+          <w:tcPr/>
+          <w:p>
+            <w:r>
+              <w:rPr>
+                <w:rFonts w:ascii="Calibri" w:hAnsi="Calibri"/>
+                <w:sz w:val="18"/>
+              </w:rPr>
+              <w:t>Lutfi</w:t>
+            </w:r>
+          </w:p>
+        </w:tc>
+        <w:tc>
+          <w:tcPr/>
+          <w:p>
+            <w:r>
+              <w:rPr>
+                <w:rFonts w:ascii="Calibri" w:hAnsi="Calibri"/>
+                <w:sz w:val="18"/>
+              </w:rPr>
+              <w:t>https://github.com/BrillianLabs/grafisaid_backend/pull/17</w:t>
             </w:r>
           </w:p>
         </w:tc>
@@ -3814,50 +3934,55 @@
                 <w:rFonts w:ascii="Calibri" w:hAnsi="Calibri"/>
                 <w:sz w:val="18"/>
               </w:rPr>
-            </w:r>
-          </w:p>
-        </w:tc>
-        <w:tc>
-          <w:tcPr/>
-          <w:p>
-            <w:r>
-              <w:rPr>
-                <w:rFonts w:ascii="Calibri" w:hAnsi="Calibri"/>
-                <w:sz w:val="18"/>
-              </w:rPr>
-            </w:r>
-          </w:p>
-        </w:tc>
-        <w:tc>
-          <w:tcPr/>
-          <w:p>
-            <w:r>
-              <w:rPr>
-                <w:rFonts w:ascii="Calibri" w:hAnsi="Calibri"/>
-                <w:sz w:val="18"/>
-              </w:rPr>
-            </w:r>
-          </w:p>
-        </w:tc>
-        <w:tc>
-          <w:tcPr/>
-          <w:p>
-            <w:r>
-              <w:rPr>
-                <w:rFonts w:ascii="Calibri" w:hAnsi="Calibri"/>
-                <w:sz w:val="18"/>
-              </w:rPr>
-            </w:r>
-          </w:p>
-        </w:tc>
-        <w:tc>
-          <w:tcPr/>
-          <w:p>
-            <w:r>
-              <w:rPr>
-                <w:rFonts w:ascii="Calibri" w:hAnsi="Calibri"/>
-                <w:sz w:val="18"/>
-              </w:rPr>
+              <w:t>19</w:t>
+            </w:r>
+          </w:p>
+        </w:tc>
+        <w:tc>
+          <w:tcPr/>
+          <w:p>
+            <w:r>
+              <w:rPr>
+                <w:rFonts w:ascii="Calibri" w:hAnsi="Calibri"/>
+                <w:sz w:val="18"/>
+              </w:rPr>
+              <w:t>Mengonfigurasi fitur obrolan (chat) frontend dan mengatasi kendala jaringan</w:t>
+            </w:r>
+          </w:p>
+        </w:tc>
+        <w:tc>
+          <w:tcPr/>
+          <w:p>
+            <w:r>
+              <w:rPr>
+                <w:rFonts w:ascii="Calibri" w:hAnsi="Calibri"/>
+                <w:sz w:val="18"/>
+              </w:rPr>
+              <w:t>Telah diimplementasikan mengonfigurasi fitur obrolan (chat) frontend dan mengatasi kendala jaringan</w:t>
+            </w:r>
+          </w:p>
+        </w:tc>
+        <w:tc>
+          <w:tcPr/>
+          <w:p>
+            <w:r>
+              <w:rPr>
+                <w:rFonts w:ascii="Calibri" w:hAnsi="Calibri"/>
+                <w:sz w:val="18"/>
+              </w:rPr>
+              <w:t>Lutfi</w:t>
+            </w:r>
+          </w:p>
+        </w:tc>
+        <w:tc>
+          <w:tcPr/>
+          <w:p>
+            <w:r>
+              <w:rPr>
+                <w:rFonts w:ascii="Calibri" w:hAnsi="Calibri"/>
+                <w:sz w:val="18"/>
+              </w:rPr>
+              <w:t>https://github.com/BrillianLabs/grafisaid_frontend/pull/25</w:t>
             </w:r>
           </w:p>
         </w:tc>
@@ -3897,50 +4022,55 @@
                 <w:rFonts w:ascii="Calibri" w:hAnsi="Calibri"/>
                 <w:sz w:val="18"/>
               </w:rPr>
-            </w:r>
-          </w:p>
-        </w:tc>
-        <w:tc>
-          <w:tcPr/>
-          <w:p>
-            <w:r>
-              <w:rPr>
-                <w:rFonts w:ascii="Calibri" w:hAnsi="Calibri"/>
-                <w:sz w:val="18"/>
-              </w:rPr>
-            </w:r>
-          </w:p>
-        </w:tc>
-        <w:tc>
-          <w:tcPr/>
-          <w:p>
-            <w:r>
-              <w:rPr>
-                <w:rFonts w:ascii="Calibri" w:hAnsi="Calibri"/>
-                <w:sz w:val="18"/>
-              </w:rPr>
-            </w:r>
-          </w:p>
-        </w:tc>
-        <w:tc>
-          <w:tcPr/>
-          <w:p>
-            <w:r>
-              <w:rPr>
-                <w:rFonts w:ascii="Calibri" w:hAnsi="Calibri"/>
-                <w:sz w:val="18"/>
-              </w:rPr>
-            </w:r>
-          </w:p>
-        </w:tc>
-        <w:tc>
-          <w:tcPr/>
-          <w:p>
-            <w:r>
-              <w:rPr>
-                <w:rFonts w:ascii="Calibri" w:hAnsi="Calibri"/>
-                <w:sz w:val="18"/>
-              </w:rPr>
+              <w:t>19</w:t>
+            </w:r>
+          </w:p>
+        </w:tc>
+        <w:tc>
+          <w:tcPr/>
+          <w:p>
+            <w:r>
+              <w:rPr>
+                <w:rFonts w:ascii="Calibri" w:hAnsi="Calibri"/>
+                <w:sz w:val="18"/>
+              </w:rPr>
+              <w:t>Penyesuaian grafik utama pada modul PSDKP Angka</w:t>
+            </w:r>
+          </w:p>
+        </w:tc>
+        <w:tc>
+          <w:tcPr/>
+          <w:p>
+            <w:r>
+              <w:rPr>
+                <w:rFonts w:ascii="Calibri" w:hAnsi="Calibri"/>
+                <w:sz w:val="18"/>
+              </w:rPr>
+              <w:t>Telah diimplementasikan penyesuaian grafik utama pada modul psdkp angka</w:t>
+            </w:r>
+          </w:p>
+        </w:tc>
+        <w:tc>
+          <w:tcPr/>
+          <w:p>
+            <w:r>
+              <w:rPr>
+                <w:rFonts w:ascii="Calibri" w:hAnsi="Calibri"/>
+                <w:sz w:val="18"/>
+              </w:rPr>
+              <w:t>Lutfi</w:t>
+            </w:r>
+          </w:p>
+        </w:tc>
+        <w:tc>
+          <w:tcPr/>
+          <w:p>
+            <w:r>
+              <w:rPr>
+                <w:rFonts w:ascii="Calibri" w:hAnsi="Calibri"/>
+                <w:sz w:val="18"/>
+              </w:rPr>
+              <w:t>https://github.com/setditjen-psdkp/api-sip/pull/5453</w:t>
             </w:r>
           </w:p>
         </w:tc>
@@ -3980,50 +4110,55 @@
                 <w:rFonts w:ascii="Calibri" w:hAnsi="Calibri"/>
                 <w:sz w:val="18"/>
               </w:rPr>
-            </w:r>
-          </w:p>
-        </w:tc>
-        <w:tc>
-          <w:tcPr/>
-          <w:p>
-            <w:r>
-              <w:rPr>
-                <w:rFonts w:ascii="Calibri" w:hAnsi="Calibri"/>
-                <w:sz w:val="18"/>
-              </w:rPr>
-            </w:r>
-          </w:p>
-        </w:tc>
-        <w:tc>
-          <w:tcPr/>
-          <w:p>
-            <w:r>
-              <w:rPr>
-                <w:rFonts w:ascii="Calibri" w:hAnsi="Calibri"/>
-                <w:sz w:val="18"/>
-              </w:rPr>
-            </w:r>
-          </w:p>
-        </w:tc>
-        <w:tc>
-          <w:tcPr/>
-          <w:p>
-            <w:r>
-              <w:rPr>
-                <w:rFonts w:ascii="Calibri" w:hAnsi="Calibri"/>
-                <w:sz w:val="18"/>
-              </w:rPr>
-            </w:r>
-          </w:p>
-        </w:tc>
-        <w:tc>
-          <w:tcPr/>
-          <w:p>
-            <w:r>
-              <w:rPr>
-                <w:rFonts w:ascii="Calibri" w:hAnsi="Calibri"/>
-                <w:sz w:val="18"/>
-              </w:rPr>
+              <w:t>19</w:t>
+            </w:r>
+          </w:p>
+        </w:tc>
+        <w:tc>
+          <w:tcPr/>
+          <w:p>
+            <w:r>
+              <w:rPr>
+                <w:rFonts w:ascii="Calibri" w:hAnsi="Calibri"/>
+                <w:sz w:val="18"/>
+              </w:rPr>
+              <w:t>Penyesuaian fitur pada modul PSDKP Angka</w:t>
+            </w:r>
+          </w:p>
+        </w:tc>
+        <w:tc>
+          <w:tcPr/>
+          <w:p>
+            <w:r>
+              <w:rPr>
+                <w:rFonts w:ascii="Calibri" w:hAnsi="Calibri"/>
+                <w:sz w:val="18"/>
+              </w:rPr>
+              <w:t>Telah diimplementasikan penyesuaian fitur pada modul psdkp angka</w:t>
+            </w:r>
+          </w:p>
+        </w:tc>
+        <w:tc>
+          <w:tcPr/>
+          <w:p>
+            <w:r>
+              <w:rPr>
+                <w:rFonts w:ascii="Calibri" w:hAnsi="Calibri"/>
+                <w:sz w:val="18"/>
+              </w:rPr>
+              <w:t>Lutfi</w:t>
+            </w:r>
+          </w:p>
+        </w:tc>
+        <w:tc>
+          <w:tcPr/>
+          <w:p>
+            <w:r>
+              <w:rPr>
+                <w:rFonts w:ascii="Calibri" w:hAnsi="Calibri"/>
+                <w:sz w:val="18"/>
+              </w:rPr>
+              <w:t>https://github.com/setditjen-psdkp/api-sip/pull/5455</w:t>
             </w:r>
           </w:p>
         </w:tc>
@@ -4063,50 +4198,55 @@
                 <w:rFonts w:ascii="Calibri" w:hAnsi="Calibri"/>
                 <w:sz w:val="18"/>
               </w:rPr>
-            </w:r>
-          </w:p>
-        </w:tc>
-        <w:tc>
-          <w:tcPr/>
-          <w:p>
-            <w:r>
-              <w:rPr>
-                <w:rFonts w:ascii="Calibri" w:hAnsi="Calibri"/>
-                <w:sz w:val="18"/>
-              </w:rPr>
-            </w:r>
-          </w:p>
-        </w:tc>
-        <w:tc>
-          <w:tcPr/>
-          <w:p>
-            <w:r>
-              <w:rPr>
-                <w:rFonts w:ascii="Calibri" w:hAnsi="Calibri"/>
-                <w:sz w:val="18"/>
-              </w:rPr>
-            </w:r>
-          </w:p>
-        </w:tc>
-        <w:tc>
-          <w:tcPr/>
-          <w:p>
-            <w:r>
-              <w:rPr>
-                <w:rFonts w:ascii="Calibri" w:hAnsi="Calibri"/>
-                <w:sz w:val="18"/>
-              </w:rPr>
-            </w:r>
-          </w:p>
-        </w:tc>
-        <w:tc>
-          <w:tcPr/>
-          <w:p>
-            <w:r>
-              <w:rPr>
-                <w:rFonts w:ascii="Calibri" w:hAnsi="Calibri"/>
-                <w:sz w:val="18"/>
-              </w:rPr>
+              <w:t>19</w:t>
+            </w:r>
+          </w:p>
+        </w:tc>
+        <w:tc>
+          <w:tcPr/>
+          <w:p>
+            <w:r>
+              <w:rPr>
+                <w:rFonts w:ascii="Calibri" w:hAnsi="Calibri"/>
+                <w:sz w:val="18"/>
+              </w:rPr>
+              <w:t>Memperbaiki pengamanan akses publik pada sistem</w:t>
+            </w:r>
+          </w:p>
+        </w:tc>
+        <w:tc>
+          <w:tcPr/>
+          <w:p>
+            <w:r>
+              <w:rPr>
+                <w:rFonts w:ascii="Calibri" w:hAnsi="Calibri"/>
+                <w:sz w:val="18"/>
+              </w:rPr>
+              <w:t>Telah diimplementasikan memperbaiki pengamanan akses publik pada sistem</w:t>
+            </w:r>
+          </w:p>
+        </w:tc>
+        <w:tc>
+          <w:tcPr/>
+          <w:p>
+            <w:r>
+              <w:rPr>
+                <w:rFonts w:ascii="Calibri" w:hAnsi="Calibri"/>
+                <w:sz w:val="18"/>
+              </w:rPr>
+              <w:t>Lutfi</w:t>
+            </w:r>
+          </w:p>
+        </w:tc>
+        <w:tc>
+          <w:tcPr/>
+          <w:p>
+            <w:r>
+              <w:rPr>
+                <w:rFonts w:ascii="Calibri" w:hAnsi="Calibri"/>
+                <w:sz w:val="18"/>
+              </w:rPr>
+              <w:t>https://github.com/setditjen-psdkp/api-sip/pull/5456</w:t>
             </w:r>
           </w:p>
         </w:tc>
@@ -4124,61 +4264,67 @@
                 <w:rFonts w:ascii="Calibri" w:hAnsi="Calibri"/>
                 <w:sz w:val="18"/>
               </w:rPr>
-            </w:r>
-          </w:p>
-        </w:tc>
-        <w:tc>
-          <w:tcPr/>
-          <w:p>
-            <w:r>
-              <w:rPr>
-                <w:rFonts w:ascii="Calibri" w:hAnsi="Calibri"/>
-                <w:sz w:val="18"/>
-              </w:rPr>
-            </w:r>
-          </w:p>
-        </w:tc>
-        <w:tc>
-          <w:tcPr/>
-          <w:p>
-            <w:r>
-              <w:rPr>
-                <w:rFonts w:ascii="Calibri" w:hAnsi="Calibri"/>
-                <w:sz w:val="18"/>
-              </w:rPr>
-            </w:r>
-          </w:p>
-        </w:tc>
-        <w:tc>
-          <w:tcPr/>
-          <w:p>
-            <w:r>
-              <w:rPr>
-                <w:rFonts w:ascii="Calibri" w:hAnsi="Calibri"/>
-                <w:sz w:val="18"/>
-              </w:rPr>
-            </w:r>
-          </w:p>
-        </w:tc>
-        <w:tc>
-          <w:tcPr/>
-          <w:p>
-            <w:r>
-              <w:rPr>
-                <w:rFonts w:ascii="Calibri" w:hAnsi="Calibri"/>
-                <w:sz w:val="18"/>
-              </w:rPr>
-            </w:r>
-          </w:p>
-        </w:tc>
-        <w:tc>
-          <w:tcPr/>
-          <w:p>
-            <w:r>
-              <w:rPr>
-                <w:rFonts w:ascii="Calibri" w:hAnsi="Calibri"/>
-                <w:sz w:val="18"/>
-              </w:rPr>
+              <w:t>W4</w:t>
+            </w:r>
+          </w:p>
+        </w:tc>
+        <w:tc>
+          <w:tcPr/>
+          <w:p>
+            <w:r>
+              <w:rPr>
+                <w:rFonts w:ascii="Calibri" w:hAnsi="Calibri"/>
+                <w:sz w:val="18"/>
+              </w:rPr>
+              <w:t>22-26</w:t>
+            </w:r>
+          </w:p>
+        </w:tc>
+        <w:tc>
+          <w:tcPr/>
+          <w:p>
+            <w:r>
+              <w:rPr>
+                <w:rFonts w:ascii="Calibri" w:hAnsi="Calibri"/>
+                <w:sz w:val="18"/>
+              </w:rPr>
+              <w:t>23</w:t>
+            </w:r>
+          </w:p>
+        </w:tc>
+        <w:tc>
+          <w:tcPr/>
+          <w:p>
+            <w:r>
+              <w:rPr>
+                <w:rFonts w:ascii="Calibri" w:hAnsi="Calibri"/>
+                <w:sz w:val="18"/>
+              </w:rPr>
+              <w:t>Pengembangan Wedding Invitation Layout</w:t>
+            </w:r>
+          </w:p>
+        </w:tc>
+        <w:tc>
+          <w:tcPr/>
+          <w:p>
+            <w:r>
+              <w:rPr>
+                <w:rFonts w:ascii="Calibri" w:hAnsi="Calibri"/>
+                <w:sz w:val="18"/>
+              </w:rPr>
+              <w:t>Finalisasi tata letak, rotasi teks "Love Story", dan perataan koordinat elemen lokasi (Location Pin) pada frontend portal</w:t>
+            </w:r>
+          </w:p>
+        </w:tc>
+        <w:tc>
+          <w:tcPr/>
+          <w:p>
+            <w:r>
+              <w:rPr>
+                <w:rFonts w:ascii="Calibri" w:hAnsi="Calibri"/>
+                <w:sz w:val="18"/>
+              </w:rPr>
+              <w:t>Lutfi</w:t>
             </w:r>
           </w:p>
         </w:tc>
@@ -4229,50 +4375,406 @@
                 <w:rFonts w:ascii="Calibri" w:hAnsi="Calibri"/>
                 <w:sz w:val="18"/>
               </w:rPr>
-            </w:r>
-          </w:p>
-        </w:tc>
-        <w:tc>
-          <w:tcPr/>
-          <w:p>
-            <w:r>
-              <w:rPr>
-                <w:rFonts w:ascii="Calibri" w:hAnsi="Calibri"/>
-                <w:sz w:val="18"/>
-              </w:rPr>
-            </w:r>
-          </w:p>
-        </w:tc>
-        <w:tc>
-          <w:tcPr/>
-          <w:p>
-            <w:r>
-              <w:rPr>
-                <w:rFonts w:ascii="Calibri" w:hAnsi="Calibri"/>
-                <w:sz w:val="18"/>
-              </w:rPr>
-            </w:r>
-          </w:p>
-        </w:tc>
-        <w:tc>
-          <w:tcPr/>
-          <w:p>
-            <w:r>
-              <w:rPr>
-                <w:rFonts w:ascii="Calibri" w:hAnsi="Calibri"/>
-                <w:sz w:val="18"/>
-              </w:rPr>
-            </w:r>
-          </w:p>
-        </w:tc>
-        <w:tc>
-          <w:tcPr/>
-          <w:p>
-            <w:r>
-              <w:rPr>
-                <w:rFonts w:ascii="Calibri" w:hAnsi="Calibri"/>
-                <w:sz w:val="18"/>
-              </w:rPr>
+              <w:t>25</w:t>
+            </w:r>
+          </w:p>
+        </w:tc>
+        <w:tc>
+          <w:tcPr/>
+          <w:p>
+            <w:r>
+              <w:rPr>
+                <w:rFonts w:ascii="Calibri" w:hAnsi="Calibri"/>
+                <w:sz w:val="18"/>
+              </w:rPr>
+              <w:t>Migrasi fitur cabang sdn-kacangan ke main</w:t>
+            </w:r>
+          </w:p>
+        </w:tc>
+        <w:tc>
+          <w:tcPr/>
+          <w:p>
+            <w:r>
+              <w:rPr>
+                <w:rFonts w:ascii="Calibri" w:hAnsi="Calibri"/>
+                <w:sz w:val="18"/>
+              </w:rPr>
+              <w:t>Pengaturan environment vars, reset data dummy presensi/cuti, pembaruan akses login admin, dan manajemen sinkronisasi cabang</w:t>
+            </w:r>
+          </w:p>
+        </w:tc>
+        <w:tc>
+          <w:tcPr/>
+          <w:p>
+            <w:r>
+              <w:rPr>
+                <w:rFonts w:ascii="Calibri" w:hAnsi="Calibri"/>
+                <w:sz w:val="18"/>
+              </w:rPr>
+              <w:t>Lutfi</w:t>
+            </w:r>
+          </w:p>
+        </w:tc>
+        <w:tc>
+          <w:tcPr/>
+          <w:p>
+            <w:r>
+              <w:rPr>
+                <w:rFonts w:ascii="Calibri" w:hAnsi="Calibri"/>
+                <w:sz w:val="18"/>
+              </w:rPr>
+            </w:r>
+          </w:p>
+        </w:tc>
+      </w:tr>
+      <w:tr>
+        <w:trPr>
+          <w:cantSplit w:val="0"/>
+          <w:tblHeader w:val="0"/>
+        </w:trPr>
+        <w:tc>
+          <w:tcPr/>
+          <w:p>
+            <w:r>
+              <w:rPr>
+                <w:rFonts w:ascii="Calibri" w:hAnsi="Calibri"/>
+                <w:sz w:val="18"/>
+              </w:rPr>
+            </w:r>
+          </w:p>
+        </w:tc>
+        <w:tc>
+          <w:tcPr/>
+          <w:p>
+            <w:r>
+              <w:rPr>
+                <w:rFonts w:ascii="Calibri" w:hAnsi="Calibri"/>
+                <w:sz w:val="18"/>
+              </w:rPr>
+            </w:r>
+          </w:p>
+        </w:tc>
+        <w:tc>
+          <w:tcPr/>
+          <w:p>
+            <w:r>
+              <w:rPr>
+                <w:rFonts w:ascii="Calibri" w:hAnsi="Calibri"/>
+                <w:sz w:val="18"/>
+              </w:rPr>
+              <w:t>26</w:t>
+            </w:r>
+          </w:p>
+        </w:tc>
+        <w:tc>
+          <w:tcPr/>
+          <w:p>
+            <w:r>
+              <w:rPr>
+                <w:rFonts w:ascii="Calibri" w:hAnsi="Calibri"/>
+                <w:sz w:val="18"/>
+              </w:rPr>
+              <w:t>Pengembangan sistem otomasi VPS Storage Backup</w:t>
+            </w:r>
+          </w:p>
+        </w:tc>
+        <w:tc>
+          <w:tcPr/>
+          <w:p>
+            <w:r>
+              <w:rPr>
+                <w:rFonts w:ascii="Calibri" w:hAnsi="Calibri"/>
+                <w:sz w:val="18"/>
+              </w:rPr>
+              <w:t>Implementasi skrip Python vps-backup-gdrive.py untuk audit penyimpan, pencadangan ke Google Drive (OAuth), dan pembersihan otomatis</w:t>
+            </w:r>
+          </w:p>
+        </w:tc>
+        <w:tc>
+          <w:tcPr/>
+          <w:p>
+            <w:r>
+              <w:rPr>
+                <w:rFonts w:ascii="Calibri" w:hAnsi="Calibri"/>
+                <w:sz w:val="18"/>
+              </w:rPr>
+              <w:t>Lutfi</w:t>
+            </w:r>
+          </w:p>
+        </w:tc>
+        <w:tc>
+          <w:tcPr/>
+          <w:p>
+            <w:r>
+              <w:rPr>
+                <w:rFonts w:ascii="Calibri" w:hAnsi="Calibri"/>
+                <w:sz w:val="18"/>
+              </w:rPr>
+            </w:r>
+          </w:p>
+        </w:tc>
+      </w:tr>
+      <w:tr>
+        <w:trPr>
+          <w:cantSplit w:val="0"/>
+          <w:tblHeader w:val="0"/>
+        </w:trPr>
+        <w:tc>
+          <w:tcPr/>
+          <w:p>
+            <w:r>
+              <w:rPr>
+                <w:rFonts w:ascii="Calibri" w:hAnsi="Calibri"/>
+                <w:sz w:val="18"/>
+              </w:rPr>
+              <w:t>W5</w:t>
+            </w:r>
+          </w:p>
+        </w:tc>
+        <w:tc>
+          <w:tcPr/>
+          <w:p>
+            <w:r>
+              <w:rPr>
+                <w:rFonts w:ascii="Calibri" w:hAnsi="Calibri"/>
+                <w:sz w:val="18"/>
+              </w:rPr>
+              <w:t>29-30</w:t>
+            </w:r>
+          </w:p>
+        </w:tc>
+        <w:tc>
+          <w:tcPr/>
+          <w:p>
+            <w:r>
+              <w:rPr>
+                <w:rFonts w:ascii="Calibri" w:hAnsi="Calibri"/>
+                <w:sz w:val="18"/>
+              </w:rPr>
+              <w:t>29</w:t>
+            </w:r>
+          </w:p>
+        </w:tc>
+        <w:tc>
+          <w:tcPr/>
+          <w:p>
+            <w:r>
+              <w:rPr>
+                <w:rFonts w:ascii="Calibri" w:hAnsi="Calibri"/>
+                <w:sz w:val="18"/>
+              </w:rPr>
+              <w:t>UAT Kewilayahan Spasial &amp; Audit Sinkronisasi OSS</w:t>
+            </w:r>
+          </w:p>
+        </w:tc>
+        <w:tc>
+          <w:tcPr/>
+          <w:p>
+            <w:r>
+              <w:rPr>
+                <w:rFonts w:ascii="Calibri" w:hAnsi="Calibri"/>
+                <w:sz w:val="18"/>
+              </w:rPr>
+              <w:t>Verifikasi topology GeoJSON (Point, Polygon, Line), resolusi kendala payload. Perbaikan NIB Duplicate dengan perintah artisan cleanup-duplicate-nib</w:t>
+            </w:r>
+          </w:p>
+        </w:tc>
+        <w:tc>
+          <w:tcPr/>
+          <w:p>
+            <w:r>
+              <w:rPr>
+                <w:rFonts w:ascii="Calibri" w:hAnsi="Calibri"/>
+                <w:sz w:val="18"/>
+              </w:rPr>
+              <w:t>Lutfi</w:t>
+            </w:r>
+          </w:p>
+        </w:tc>
+        <w:tc>
+          <w:tcPr/>
+          <w:p>
+            <w:r>
+              <w:rPr>
+                <w:rFonts w:ascii="Calibri" w:hAnsi="Calibri"/>
+                <w:sz w:val="18"/>
+              </w:rPr>
+              <w:t>https://github.com/setditjen-psdkp/api-sip/issues/4849 https://github.com/setditjen-psdkp/api-sip/issues/4689</w:t>
+            </w:r>
+          </w:p>
+        </w:tc>
+      </w:tr>
+      <w:tr>
+        <w:trPr>
+          <w:cantSplit w:val="0"/>
+          <w:tblHeader w:val="0"/>
+        </w:trPr>
+        <w:tc>
+          <w:tcPr/>
+          <w:p>
+            <w:r>
+              <w:rPr>
+                <w:rFonts w:ascii="Calibri" w:hAnsi="Calibri"/>
+                <w:sz w:val="18"/>
+              </w:rPr>
+            </w:r>
+          </w:p>
+        </w:tc>
+        <w:tc>
+          <w:tcPr/>
+          <w:p>
+            <w:r>
+              <w:rPr>
+                <w:rFonts w:ascii="Calibri" w:hAnsi="Calibri"/>
+                <w:sz w:val="18"/>
+              </w:rPr>
+            </w:r>
+          </w:p>
+        </w:tc>
+        <w:tc>
+          <w:tcPr/>
+          <w:p>
+            <w:r>
+              <w:rPr>
+                <w:rFonts w:ascii="Calibri" w:hAnsi="Calibri"/>
+                <w:sz w:val="18"/>
+              </w:rPr>
+              <w:t>29</w:t>
+            </w:r>
+          </w:p>
+        </w:tc>
+        <w:tc>
+          <w:tcPr/>
+          <w:p>
+            <w:r>
+              <w:rPr>
+                <w:rFonts w:ascii="Calibri" w:hAnsi="Calibri"/>
+                <w:sz w:val="18"/>
+              </w:rPr>
+              <w:t>Optimasi performa eksport SKP &amp; Spatial Mapping</w:t>
+            </w:r>
+          </w:p>
+        </w:tc>
+        <w:tc>
+          <w:tcPr/>
+          <w:p>
+            <w:r>
+              <w:rPr>
+                <w:rFonts w:ascii="Calibri" w:hAnsi="Calibri"/>
+                <w:sz w:val="18"/>
+              </w:rPr>
+              <w:t>Implementasi export chunking (500 data) untuk memecahkan error 500 saat generasi excel dan validasi sinkronisasi koordinat kosong</w:t>
+            </w:r>
+          </w:p>
+        </w:tc>
+        <w:tc>
+          <w:tcPr/>
+          <w:p>
+            <w:r>
+              <w:rPr>
+                <w:rFonts w:ascii="Calibri" w:hAnsi="Calibri"/>
+                <w:sz w:val="18"/>
+              </w:rPr>
+              <w:t>Lutfi</w:t>
+            </w:r>
+          </w:p>
+        </w:tc>
+        <w:tc>
+          <w:tcPr/>
+          <w:p>
+            <w:r>
+              <w:rPr>
+                <w:rFonts w:ascii="Calibri" w:hAnsi="Calibri"/>
+                <w:sz w:val="18"/>
+              </w:rPr>
+            </w:r>
+          </w:p>
+        </w:tc>
+      </w:tr>
+      <w:tr>
+        <w:trPr>
+          <w:cantSplit w:val="0"/>
+          <w:tblHeader w:val="0"/>
+        </w:trPr>
+        <w:tc>
+          <w:tcPr/>
+          <w:p>
+            <w:r>
+              <w:rPr>
+                <w:rFonts w:ascii="Calibri" w:hAnsi="Calibri"/>
+                <w:sz w:val="18"/>
+              </w:rPr>
+            </w:r>
+          </w:p>
+        </w:tc>
+        <w:tc>
+          <w:tcPr/>
+          <w:p>
+            <w:r>
+              <w:rPr>
+                <w:rFonts w:ascii="Calibri" w:hAnsi="Calibri"/>
+                <w:sz w:val="18"/>
+              </w:rPr>
+            </w:r>
+          </w:p>
+        </w:tc>
+        <w:tc>
+          <w:tcPr/>
+          <w:p>
+            <w:r>
+              <w:rPr>
+                <w:rFonts w:ascii="Calibri" w:hAnsi="Calibri"/>
+                <w:sz w:val="18"/>
+              </w:rPr>
+              <w:t>30</w:t>
+            </w:r>
+          </w:p>
+        </w:tc>
+        <w:tc>
+          <w:tcPr/>
+          <w:p>
+            <w:r>
+              <w:rPr>
+                <w:rFonts w:ascii="Calibri" w:hAnsi="Calibri"/>
+                <w:sz w:val="18"/>
+              </w:rPr>
+              <w:t>Resolusi Error Git &amp; Integrasi Layanan Backend</w:t>
+            </w:r>
+          </w:p>
+        </w:tc>
+        <w:tc>
+          <w:tcPr/>
+          <w:p>
+            <w:r>
+              <w:rPr>
+                <w:rFonts w:ascii="Calibri" w:hAnsi="Calibri"/>
+                <w:sz w:val="18"/>
+              </w:rPr>
+              <w:t>Perbaikan URL profil, sinkronisasi repositori lintas platform, resolusi TypeError payment service fallback konfigurasi</w:t>
+            </w:r>
+          </w:p>
+        </w:tc>
+        <w:tc>
+          <w:tcPr/>
+          <w:p>
+            <w:r>
+              <w:rPr>
+                <w:rFonts w:ascii="Calibri" w:hAnsi="Calibri"/>
+                <w:sz w:val="18"/>
+              </w:rPr>
+              <w:t>Lutfi</w:t>
+            </w:r>
+          </w:p>
+        </w:tc>
+        <w:tc>
+          <w:tcPr/>
+          <w:p>
+            <w:r>
+              <w:rPr>
+                <w:rFonts w:ascii="Calibri" w:hAnsi="Calibri"/>
+                <w:sz w:val="18"/>
+              </w:rPr>
+              <w:t>https://github.com/BrillianLabs/grafisaid_backend/issues/64</w:t>
             </w:r>
           </w:p>
         </w:tc>

</xml_diff>